<commit_message>
feat: check-in/swap flow, transactions filters, WIB timezone + docs
</commit_message>
<xml_diff>
--- a/docs/TEST-Fullstack-Developer-ECGO.docx
+++ b/docs/TEST-Fullstack-Developer-ECGO.docx
@@ -581,6 +581,7 @@
               <w:t xml:space="preserve"> </w:t>
             </w:r>
             <w:proofErr w:type="spellStart"/>
+            <w:proofErr w:type="gramStart"/>
             <w:r>
               <w:rPr>
                 <w:sz w:val="17"/>
@@ -594,7 +595,15 @@
                 <w:sz w:val="17"/>
                 <w:szCs w:val="17"/>
               </w:rPr>
-              <w:t xml:space="preserve">  |  Sesi 1 </w:t>
+              <w:t xml:space="preserve">  |</w:t>
+            </w:r>
+            <w:proofErr w:type="gramEnd"/>
+            <w:r>
+              <w:rPr>
+                <w:sz w:val="17"/>
+                <w:szCs w:val="17"/>
+              </w:rPr>
+              <w:t xml:space="preserve">  Sesi 1 </w:t>
             </w:r>
             <w:proofErr w:type="spellStart"/>
             <w:r>
@@ -1275,13 +1284,6 @@
             <w:pPr>
               <w:spacing w:line="260" w:lineRule="auto"/>
             </w:pPr>
-            <w:r>
-              <w:rPr>
-                <w:sz w:val="17"/>
-                <w:szCs w:val="17"/>
-              </w:rPr>
-              <w:t xml:space="preserve"> </w:t>
-            </w:r>
           </w:p>
         </w:tc>
       </w:tr>
@@ -1441,7 +1443,21 @@
                 <w:sz w:val="17"/>
                 <w:szCs w:val="17"/>
               </w:rPr>
-              <w:t xml:space="preserve">(code generation &amp; debug) </w:t>
+              <w:t>(</w:t>
+            </w:r>
+            <w:r>
+              <w:rPr>
+                <w:sz w:val="17"/>
+                <w:szCs w:val="17"/>
+              </w:rPr>
+              <w:t>plan, code generation</w:t>
+            </w:r>
+            <w:r>
+              <w:rPr>
+                <w:sz w:val="17"/>
+                <w:szCs w:val="17"/>
+              </w:rPr>
+              <w:t xml:space="preserve"> &amp; debug) </w:t>
             </w:r>
             <w:proofErr w:type="spellStart"/>
             <w:r>
@@ -6756,7 +6772,29 @@
           <w:sz w:val="30"/>
           <w:szCs w:val="30"/>
         </w:rPr>
-        <w:t xml:space="preserve"> &amp; Fundamental  (25 </w:t>
+        <w:t xml:space="preserve"> &amp; </w:t>
+      </w:r>
+      <w:proofErr w:type="gramStart"/>
+      <w:r>
+        <w:rPr>
+          <w:b/>
+          <w:bCs/>
+          <w:color w:val="0B3D2E"/>
+          <w:sz w:val="30"/>
+          <w:szCs w:val="30"/>
+        </w:rPr>
+        <w:t>Fundamental  (</w:t>
+      </w:r>
+      <w:proofErr w:type="gramEnd"/>
+      <w:r>
+        <w:rPr>
+          <w:b/>
+          <w:bCs/>
+          <w:color w:val="0B3D2E"/>
+          <w:sz w:val="30"/>
+          <w:szCs w:val="30"/>
+        </w:rPr>
+        <w:t xml:space="preserve">25 </w:t>
       </w:r>
       <w:proofErr w:type="spellStart"/>
       <w:r>
@@ -7239,6 +7277,7 @@
               <w:t xml:space="preserve"> = </w:t>
             </w:r>
             <w:proofErr w:type="spellStart"/>
+            <w:proofErr w:type="gramStart"/>
             <w:r>
               <w:t>aman</w:t>
             </w:r>
@@ -7251,6 +7290,7 @@
               <w:t>harus</w:t>
             </w:r>
             <w:proofErr w:type="spellEnd"/>
+            <w:proofErr w:type="gramEnd"/>
             <w:r>
               <w:t xml:space="preserve"> </w:t>
             </w:r>
@@ -7320,7 +7360,15 @@
               </w:numPr>
             </w:pPr>
             <w:r>
-              <w:t xml:space="preserve">Type assertion ( as ) = </w:t>
+              <w:t xml:space="preserve">Type assertion </w:t>
+            </w:r>
+            <w:proofErr w:type="gramStart"/>
+            <w:r>
+              <w:t>( as</w:t>
+            </w:r>
+            <w:proofErr w:type="gramEnd"/>
+            <w:r>
+              <w:t xml:space="preserve"> ) = </w:t>
             </w:r>
             <w:proofErr w:type="spellStart"/>
             <w:r>
@@ -7375,10 +7423,12 @@
               <w:t>: type guard (</w:t>
             </w:r>
             <w:proofErr w:type="spellStart"/>
+            <w:proofErr w:type="gramStart"/>
             <w:r>
               <w:t>typeof,instanceof</w:t>
             </w:r>
             <w:proofErr w:type="spellEnd"/>
+            <w:proofErr w:type="gramEnd"/>
             <w:r>
               <w:t xml:space="preserve">, </w:t>
             </w:r>
@@ -7701,11 +7751,16 @@
             <w:r>
               <w:t xml:space="preserve">effect, </w:t>
             </w:r>
+            <w:proofErr w:type="gramStart"/>
             <w:r>
               <w:t xml:space="preserve">3 </w:t>
             </w:r>
             <w:r>
-              <w:t xml:space="preserve"> event handler</w:t>
+              <w:t xml:space="preserve"> event</w:t>
+            </w:r>
+            <w:proofErr w:type="gramEnd"/>
+            <w:r>
+              <w:t xml:space="preserve"> handler</w:t>
             </w:r>
           </w:p>
         </w:tc>
@@ -7998,12 +8053,17 @@
               </w:numPr>
             </w:pPr>
             <w:proofErr w:type="spellStart"/>
+            <w:proofErr w:type="gramStart"/>
             <w:r>
               <w:t>Kemungkinan</w:t>
             </w:r>
             <w:proofErr w:type="spellEnd"/>
             <w:r>
-              <w:t xml:space="preserve"> : Data cache, Router Cache, </w:t>
+              <w:t xml:space="preserve"> :</w:t>
+            </w:r>
+            <w:proofErr w:type="gramEnd"/>
+            <w:r>
+              <w:t xml:space="preserve"> Data cache, Router Cache, </w:t>
             </w:r>
             <w:proofErr w:type="spellStart"/>
             <w:r>
@@ -8023,12 +8083,17 @@
               </w:numPr>
             </w:pPr>
             <w:proofErr w:type="spellStart"/>
+            <w:proofErr w:type="gramStart"/>
             <w:r>
               <w:t>Diagnosa</w:t>
             </w:r>
             <w:proofErr w:type="spellEnd"/>
             <w:r>
-              <w:t xml:space="preserve"> : </w:t>
+              <w:t xml:space="preserve"> :</w:t>
+            </w:r>
+            <w:proofErr w:type="gramEnd"/>
+            <w:r>
+              <w:t xml:space="preserve"> </w:t>
             </w:r>
             <w:proofErr w:type="spellStart"/>
             <w:r>
@@ -8047,24 +8112,39 @@
                 <w:numId w:val="19"/>
               </w:numPr>
             </w:pPr>
-            <w:r>
-              <w:t xml:space="preserve">Fix : </w:t>
-            </w:r>
-            <w:proofErr w:type="spellStart"/>
+            <w:proofErr w:type="gramStart"/>
+            <w:r>
+              <w:t>Fix :</w:t>
+            </w:r>
+            <w:proofErr w:type="gramEnd"/>
+            <w:r>
+              <w:t xml:space="preserve"> </w:t>
+            </w:r>
+            <w:proofErr w:type="spellStart"/>
+            <w:proofErr w:type="gramStart"/>
             <w:r>
               <w:t>revalidateTag</w:t>
             </w:r>
             <w:proofErr w:type="spellEnd"/>
             <w:r>
-              <w:t xml:space="preserve">() / </w:t>
-            </w:r>
-            <w:proofErr w:type="spellStart"/>
+              <w:t>(</w:t>
+            </w:r>
+            <w:proofErr w:type="gramEnd"/>
+            <w:r>
+              <w:t xml:space="preserve">) / </w:t>
+            </w:r>
+            <w:proofErr w:type="spellStart"/>
+            <w:proofErr w:type="gramStart"/>
             <w:r>
               <w:t>revalidatePath</w:t>
             </w:r>
             <w:proofErr w:type="spellEnd"/>
             <w:r>
-              <w:t xml:space="preserve">() </w:t>
+              <w:t>(</w:t>
+            </w:r>
+            <w:proofErr w:type="gramEnd"/>
+            <w:r>
+              <w:t xml:space="preserve">) </w:t>
             </w:r>
             <w:proofErr w:type="spellStart"/>
             <w:r>
@@ -8277,6 +8357,7 @@
           </w:tcPr>
           <w:p>
             <w:proofErr w:type="spellStart"/>
+            <w:proofErr w:type="gramStart"/>
             <w:r>
               <w:rPr>
                 <w:rFonts w:ascii="Consolas" w:eastAsia="Consolas" w:hAnsi="Consolas" w:cs="Consolas"/>
@@ -8294,10 +8375,9 @@
                 <w:sz w:val="15"/>
                 <w:szCs w:val="15"/>
               </w:rPr>
-              <w:t>(() =&gt; {</w:t>
-            </w:r>
-          </w:p>
-          <w:p>
+              <w:t>(</w:t>
+            </w:r>
+            <w:proofErr w:type="gramEnd"/>
             <w:r>
               <w:rPr>
                 <w:rFonts w:ascii="Consolas" w:eastAsia="Consolas" w:hAnsi="Consolas" w:cs="Consolas"/>
@@ -8305,6 +8385,17 @@
                 <w:sz w:val="15"/>
                 <w:szCs w:val="15"/>
               </w:rPr>
+              <w:t>() =&gt; {</w:t>
+            </w:r>
+          </w:p>
+          <w:p>
+            <w:r>
+              <w:rPr>
+                <w:rFonts w:ascii="Consolas" w:eastAsia="Consolas" w:hAnsi="Consolas" w:cs="Consolas"/>
+                <w:color w:val="14201B"/>
+                <w:sz w:val="15"/>
+                <w:szCs w:val="15"/>
+              </w:rPr>
               <w:t xml:space="preserve">  fetch(`/</w:t>
             </w:r>
             <w:proofErr w:type="spellStart"/>
@@ -8356,9 +8447,9 @@
                 <w:sz w:val="15"/>
                 <w:szCs w:val="15"/>
               </w:rPr>
-              <w:t xml:space="preserve">    .then(r =&gt; </w:t>
-            </w:r>
-            <w:proofErr w:type="spellStart"/>
+              <w:t xml:space="preserve">    </w:t>
+            </w:r>
+            <w:proofErr w:type="gramStart"/>
             <w:r>
               <w:rPr>
                 <w:rFonts w:ascii="Consolas" w:eastAsia="Consolas" w:hAnsi="Consolas" w:cs="Consolas"/>
@@ -8366,9 +8457,31 @@
                 <w:sz w:val="15"/>
                 <w:szCs w:val="15"/>
               </w:rPr>
+              <w:t>.then</w:t>
+            </w:r>
+            <w:proofErr w:type="gramEnd"/>
+            <w:r>
+              <w:rPr>
+                <w:rFonts w:ascii="Consolas" w:eastAsia="Consolas" w:hAnsi="Consolas" w:cs="Consolas"/>
+                <w:color w:val="14201B"/>
+                <w:sz w:val="15"/>
+                <w:szCs w:val="15"/>
+              </w:rPr>
+              <w:t xml:space="preserve">(r =&gt; </w:t>
+            </w:r>
+            <w:proofErr w:type="spellStart"/>
+            <w:proofErr w:type="gramStart"/>
+            <w:r>
+              <w:rPr>
+                <w:rFonts w:ascii="Consolas" w:eastAsia="Consolas" w:hAnsi="Consolas" w:cs="Consolas"/>
+                <w:color w:val="14201B"/>
+                <w:sz w:val="15"/>
+                <w:szCs w:val="15"/>
+              </w:rPr>
               <w:t>r.json</w:t>
             </w:r>
             <w:proofErr w:type="spellEnd"/>
+            <w:proofErr w:type="gramEnd"/>
             <w:r>
               <w:rPr>
                 <w:rFonts w:ascii="Consolas" w:eastAsia="Consolas" w:hAnsi="Consolas" w:cs="Consolas"/>
@@ -8387,7 +8500,27 @@
                 <w:sz w:val="15"/>
                 <w:szCs w:val="15"/>
               </w:rPr>
-              <w:t xml:space="preserve">    .then(</w:t>
+              <w:t xml:space="preserve">    </w:t>
+            </w:r>
+            <w:proofErr w:type="gramStart"/>
+            <w:r>
+              <w:rPr>
+                <w:rFonts w:ascii="Consolas" w:eastAsia="Consolas" w:hAnsi="Consolas" w:cs="Consolas"/>
+                <w:color w:val="14201B"/>
+                <w:sz w:val="15"/>
+                <w:szCs w:val="15"/>
+              </w:rPr>
+              <w:t>.then</w:t>
+            </w:r>
+            <w:proofErr w:type="gramEnd"/>
+            <w:r>
+              <w:rPr>
+                <w:rFonts w:ascii="Consolas" w:eastAsia="Consolas" w:hAnsi="Consolas" w:cs="Consolas"/>
+                <w:color w:val="14201B"/>
+                <w:sz w:val="15"/>
+                <w:szCs w:val="15"/>
+              </w:rPr>
+              <w:t>(</w:t>
             </w:r>
             <w:proofErr w:type="spellStart"/>
             <w:r>
@@ -8512,8 +8645,13 @@
                 <w:numId w:val="20"/>
               </w:numPr>
             </w:pPr>
-            <w:r>
-              <w:t xml:space="preserve">Fix : </w:t>
+            <w:proofErr w:type="gramStart"/>
+            <w:r>
+              <w:t>Fix :</w:t>
+            </w:r>
+            <w:proofErr w:type="gramEnd"/>
+            <w:r>
+              <w:t xml:space="preserve"> </w:t>
             </w:r>
             <w:proofErr w:type="spellStart"/>
             <w:r>
@@ -8772,12 +8910,17 @@
               </w:numPr>
             </w:pPr>
             <w:proofErr w:type="spellStart"/>
+            <w:proofErr w:type="gramStart"/>
             <w:r>
               <w:t>Berguna</w:t>
             </w:r>
             <w:proofErr w:type="spellEnd"/>
             <w:r>
-              <w:t xml:space="preserve"> : </w:t>
+              <w:t xml:space="preserve"> :</w:t>
+            </w:r>
+            <w:proofErr w:type="gramEnd"/>
+            <w:r>
+              <w:t xml:space="preserve"> </w:t>
             </w:r>
             <w:proofErr w:type="spellStart"/>
             <w:r>
@@ -10652,8 +10795,13 @@
                 <w:numId w:val="26"/>
               </w:numPr>
             </w:pPr>
-            <w:r>
-              <w:t xml:space="preserve">Flow : Browser </w:t>
+            <w:proofErr w:type="gramStart"/>
+            <w:r>
+              <w:t>Flow :</w:t>
+            </w:r>
+            <w:proofErr w:type="gramEnd"/>
+            <w:r>
+              <w:t xml:space="preserve"> Browser </w:t>
             </w:r>
             <w:proofErr w:type="spellStart"/>
             <w:r>
@@ -10871,7 +11019,15 @@
             </w:r>
             <w:proofErr w:type="spellEnd"/>
             <w:r>
-              <w:t xml:space="preserve"> timestamp + hash  dan face recognition).</w:t>
+              <w:t xml:space="preserve"> timestamp + </w:t>
+            </w:r>
+            <w:proofErr w:type="gramStart"/>
+            <w:r>
+              <w:t>hash  dan</w:t>
+            </w:r>
+            <w:proofErr w:type="gramEnd"/>
+            <w:r>
+              <w:t xml:space="preserve"> face recognition).</w:t>
             </w:r>
           </w:p>
         </w:tc>
@@ -10930,6 +11086,7 @@
               <w:t xml:space="preserve"> hook </w:t>
             </w:r>
             <w:proofErr w:type="spellStart"/>
+            <w:proofErr w:type="gramStart"/>
             <w:r>
               <w:rPr>
                 <w:rFonts w:ascii="Consolas" w:eastAsia="Consolas" w:hAnsi="Consolas" w:cs="Consolas"/>
@@ -10949,7 +11106,18 @@
                 <w:szCs w:val="17"/>
                 <w:shd w:val="clear" w:color="auto" w:fill="EAF3EE"/>
               </w:rPr>
-              <w:t>()</w:t>
+              <w:t>(</w:t>
+            </w:r>
+            <w:proofErr w:type="gramEnd"/>
+            <w:r>
+              <w:rPr>
+                <w:rFonts w:ascii="Consolas" w:eastAsia="Consolas" w:hAnsi="Consolas" w:cs="Consolas"/>
+                <w:color w:val="0B3D2E"/>
+                <w:sz w:val="17"/>
+                <w:szCs w:val="17"/>
+                <w:shd w:val="clear" w:color="auto" w:fill="EAF3EE"/>
+              </w:rPr>
+              <w:t>)</w:t>
             </w:r>
             <w:r>
               <w:t xml:space="preserve"> di Next.js 15, dan </w:t>
@@ -11053,12 +11221,17 @@
               <w:t xml:space="preserve">Hook </w:t>
             </w:r>
             <w:proofErr w:type="spellStart"/>
+            <w:proofErr w:type="gramStart"/>
             <w:r>
               <w:t>useServerState</w:t>
             </w:r>
             <w:proofErr w:type="spellEnd"/>
             <w:r>
-              <w:t xml:space="preserve">() </w:t>
+              <w:t>(</w:t>
+            </w:r>
+            <w:proofErr w:type="gramEnd"/>
+            <w:r>
+              <w:t xml:space="preserve">) </w:t>
             </w:r>
             <w:proofErr w:type="spellStart"/>
             <w:r>
@@ -11131,6 +11304,7 @@
               <w:t xml:space="preserve"> </w:t>
             </w:r>
             <w:proofErr w:type="spellStart"/>
+            <w:proofErr w:type="gramStart"/>
             <w:r>
               <w:rPr>
                 <w:rFonts w:ascii="Consolas" w:eastAsia="Consolas" w:hAnsi="Consolas" w:cs="Consolas"/>
@@ -11150,7 +11324,18 @@
                 <w:szCs w:val="17"/>
                 <w:shd w:val="clear" w:color="auto" w:fill="EAF3EE"/>
               </w:rPr>
-              <w:t>()</w:t>
+              <w:t>(</w:t>
+            </w:r>
+            <w:proofErr w:type="gramEnd"/>
+            <w:r>
+              <w:rPr>
+                <w:rFonts w:ascii="Consolas" w:eastAsia="Consolas" w:hAnsi="Consolas" w:cs="Consolas"/>
+                <w:color w:val="0B3D2E"/>
+                <w:sz w:val="17"/>
+                <w:szCs w:val="17"/>
+                <w:shd w:val="clear" w:color="auto" w:fill="EAF3EE"/>
+              </w:rPr>
+              <w:t>)</w:t>
             </w:r>
             <w:r>
               <w:t xml:space="preserve"> </w:t>
@@ -11180,6 +11365,7 @@
               <w:t xml:space="preserve"> </w:t>
             </w:r>
             <w:proofErr w:type="spellStart"/>
+            <w:proofErr w:type="gramStart"/>
             <w:r>
               <w:rPr>
                 <w:rFonts w:ascii="Consolas" w:eastAsia="Consolas" w:hAnsi="Consolas" w:cs="Consolas"/>
@@ -11199,7 +11385,18 @@
                 <w:szCs w:val="17"/>
                 <w:shd w:val="clear" w:color="auto" w:fill="EAF3EE"/>
               </w:rPr>
-              <w:t>()</w:t>
+              <w:t>(</w:t>
+            </w:r>
+            <w:proofErr w:type="gramEnd"/>
+            <w:r>
+              <w:rPr>
+                <w:rFonts w:ascii="Consolas" w:eastAsia="Consolas" w:hAnsi="Consolas" w:cs="Consolas"/>
+                <w:color w:val="0B3D2E"/>
+                <w:sz w:val="17"/>
+                <w:szCs w:val="17"/>
+                <w:shd w:val="clear" w:color="auto" w:fill="EAF3EE"/>
+              </w:rPr>
+              <w:t>)</w:t>
             </w:r>
             <w:r>
               <w:t xml:space="preserve"> </w:t>
@@ -11265,12 +11462,17 @@
               <w:t xml:space="preserve">Function </w:t>
             </w:r>
             <w:proofErr w:type="spellStart"/>
+            <w:proofErr w:type="gramStart"/>
             <w:r>
               <w:t>revalidateCache</w:t>
             </w:r>
             <w:proofErr w:type="spellEnd"/>
             <w:r>
-              <w:t xml:space="preserve">() </w:t>
+              <w:t>(</w:t>
+            </w:r>
+            <w:proofErr w:type="gramEnd"/>
+            <w:r>
+              <w:t xml:space="preserve">) </w:t>
             </w:r>
             <w:proofErr w:type="spellStart"/>
             <w:r>
@@ -11305,20 +11507,30 @@
               <w:t xml:space="preserve"> </w:t>
             </w:r>
             <w:proofErr w:type="spellStart"/>
+            <w:proofErr w:type="gramStart"/>
             <w:r>
               <w:t>revalidatePath</w:t>
             </w:r>
             <w:proofErr w:type="spellEnd"/>
             <w:r>
-              <w:t xml:space="preserve">() dan </w:t>
-            </w:r>
-            <w:proofErr w:type="spellStart"/>
+              <w:t>(</w:t>
+            </w:r>
+            <w:proofErr w:type="gramEnd"/>
+            <w:r>
+              <w:t xml:space="preserve">) dan </w:t>
+            </w:r>
+            <w:proofErr w:type="spellStart"/>
+            <w:proofErr w:type="gramStart"/>
             <w:r>
               <w:t>revalidateTag</w:t>
             </w:r>
             <w:proofErr w:type="spellEnd"/>
             <w:r>
-              <w:t xml:space="preserve">() </w:t>
+              <w:t>(</w:t>
+            </w:r>
+            <w:proofErr w:type="gramEnd"/>
+            <w:r>
+              <w:t xml:space="preserve">) </w:t>
             </w:r>
             <w:proofErr w:type="spellStart"/>
             <w:r>
@@ -11391,7 +11603,29 @@
           <w:szCs w:val="30"/>
         </w:rPr>
         <w:lastRenderedPageBreak/>
-        <w:t xml:space="preserve">Bagian B — Problem Solving  (30 </w:t>
+        <w:t xml:space="preserve">Bagian B — Problem </w:t>
+      </w:r>
+      <w:proofErr w:type="gramStart"/>
+      <w:r>
+        <w:rPr>
+          <w:b/>
+          <w:bCs/>
+          <w:color w:val="0B3D2E"/>
+          <w:sz w:val="30"/>
+          <w:szCs w:val="30"/>
+        </w:rPr>
+        <w:t>Solving  (</w:t>
+      </w:r>
+      <w:proofErr w:type="gramEnd"/>
+      <w:r>
+        <w:rPr>
+          <w:b/>
+          <w:bCs/>
+          <w:color w:val="0B3D2E"/>
+          <w:sz w:val="30"/>
+          <w:szCs w:val="30"/>
+        </w:rPr>
+        <w:t xml:space="preserve">30 </w:t>
       </w:r>
       <w:proofErr w:type="spellStart"/>
       <w:r>
@@ -11473,7 +11707,29 @@
           <w:sz w:val="23"/>
           <w:szCs w:val="23"/>
         </w:rPr>
-        <w:t xml:space="preserve">B1. Multi-Branch Geofence Check-In   (20 </w:t>
+        <w:t>B1. Multi-Branch Geofence Check-In</w:t>
+      </w:r>
+      <w:proofErr w:type="gramStart"/>
+      <w:r>
+        <w:rPr>
+          <w:b/>
+          <w:bCs/>
+          <w:color w:val="14543E"/>
+          <w:sz w:val="23"/>
+          <w:szCs w:val="23"/>
+        </w:rPr>
+        <w:t xml:space="preserve">   (</w:t>
+      </w:r>
+      <w:proofErr w:type="gramEnd"/>
+      <w:r>
+        <w:rPr>
+          <w:b/>
+          <w:bCs/>
+          <w:color w:val="14543E"/>
+          <w:sz w:val="23"/>
+          <w:szCs w:val="23"/>
+        </w:rPr>
+        <w:t xml:space="preserve">20 </w:t>
       </w:r>
       <w:proofErr w:type="spellStart"/>
       <w:r>
@@ -11835,9 +12091,9 @@
                 <w:sz w:val="15"/>
                 <w:szCs w:val="15"/>
               </w:rPr>
-              <w:t xml:space="preserve">: number;      // radius geofence </w:t>
-            </w:r>
-            <w:proofErr w:type="spellStart"/>
+              <w:t xml:space="preserve">: </w:t>
+            </w:r>
+            <w:proofErr w:type="gramStart"/>
             <w:r>
               <w:rPr>
                 <w:rFonts w:ascii="Consolas" w:eastAsia="Consolas" w:hAnsi="Consolas" w:cs="Consolas"/>
@@ -11845,6 +12101,26 @@
                 <w:sz w:val="15"/>
                 <w:szCs w:val="15"/>
               </w:rPr>
+              <w:t xml:space="preserve">number;   </w:t>
+            </w:r>
+            <w:proofErr w:type="gramEnd"/>
+            <w:r>
+              <w:rPr>
+                <w:rFonts w:ascii="Consolas" w:eastAsia="Consolas" w:hAnsi="Consolas" w:cs="Consolas"/>
+                <w:color w:val="DCEFE5"/>
+                <w:sz w:val="15"/>
+                <w:szCs w:val="15"/>
+              </w:rPr>
+              <w:t xml:space="preserve">   // radius geofence </w:t>
+            </w:r>
+            <w:proofErr w:type="spellStart"/>
+            <w:r>
+              <w:rPr>
+                <w:rFonts w:ascii="Consolas" w:eastAsia="Consolas" w:hAnsi="Consolas" w:cs="Consolas"/>
+                <w:color w:val="DCEFE5"/>
+                <w:sz w:val="15"/>
+                <w:szCs w:val="15"/>
+              </w:rPr>
               <w:t>dalam</w:t>
             </w:r>
             <w:proofErr w:type="spellEnd"/>
@@ -12052,9 +12328,9 @@
                 <w:sz w:val="15"/>
                 <w:szCs w:val="15"/>
               </w:rPr>
-              <w:t xml:space="preserve">: number;    // </w:t>
-            </w:r>
-            <w:proofErr w:type="spellStart"/>
+              <w:t xml:space="preserve">: </w:t>
+            </w:r>
+            <w:proofErr w:type="gramStart"/>
             <w:r>
               <w:rPr>
                 <w:rFonts w:ascii="Consolas" w:eastAsia="Consolas" w:hAnsi="Consolas" w:cs="Consolas"/>
@@ -12062,6 +12338,26 @@
                 <w:sz w:val="15"/>
                 <w:szCs w:val="15"/>
               </w:rPr>
+              <w:t xml:space="preserve">number;   </w:t>
+            </w:r>
+            <w:proofErr w:type="gramEnd"/>
+            <w:r>
+              <w:rPr>
+                <w:rFonts w:ascii="Consolas" w:eastAsia="Consolas" w:hAnsi="Consolas" w:cs="Consolas"/>
+                <w:color w:val="DCEFE5"/>
+                <w:sz w:val="15"/>
+                <w:szCs w:val="15"/>
+              </w:rPr>
+              <w:t xml:space="preserve"> // </w:t>
+            </w:r>
+            <w:proofErr w:type="spellStart"/>
+            <w:r>
+              <w:rPr>
+                <w:rFonts w:ascii="Consolas" w:eastAsia="Consolas" w:hAnsi="Consolas" w:cs="Consolas"/>
+                <w:color w:val="DCEFE5"/>
+                <w:sz w:val="15"/>
+                <w:szCs w:val="15"/>
+              </w:rPr>
               <w:t>akurasi</w:t>
             </w:r>
             <w:proofErr w:type="spellEnd"/>
@@ -12123,9 +12419,9 @@
                 <w:sz w:val="15"/>
                 <w:szCs w:val="15"/>
               </w:rPr>
-              <w:t xml:space="preserve">  at: string;           // ISO-8601 </w:t>
-            </w:r>
-            <w:proofErr w:type="spellStart"/>
+              <w:t xml:space="preserve">  at: </w:t>
+            </w:r>
+            <w:proofErr w:type="gramStart"/>
             <w:r>
               <w:rPr>
                 <w:rFonts w:ascii="Consolas" w:eastAsia="Consolas" w:hAnsi="Consolas" w:cs="Consolas"/>
@@ -12133,6 +12429,26 @@
                 <w:sz w:val="15"/>
                 <w:szCs w:val="15"/>
               </w:rPr>
+              <w:t xml:space="preserve">string;   </w:t>
+            </w:r>
+            <w:proofErr w:type="gramEnd"/>
+            <w:r>
+              <w:rPr>
+                <w:rFonts w:ascii="Consolas" w:eastAsia="Consolas" w:hAnsi="Consolas" w:cs="Consolas"/>
+                <w:color w:val="DCEFE5"/>
+                <w:sz w:val="15"/>
+                <w:szCs w:val="15"/>
+              </w:rPr>
+              <w:t xml:space="preserve">        // ISO-8601 </w:t>
+            </w:r>
+            <w:proofErr w:type="spellStart"/>
+            <w:r>
+              <w:rPr>
+                <w:rFonts w:ascii="Consolas" w:eastAsia="Consolas" w:hAnsi="Consolas" w:cs="Consolas"/>
+                <w:color w:val="DCEFE5"/>
+                <w:sz w:val="15"/>
+                <w:szCs w:val="15"/>
+              </w:rPr>
               <w:t>dengan</w:t>
             </w:r>
             <w:proofErr w:type="spellEnd"/>
@@ -12187,9 +12503,9 @@
                 <w:sz w:val="15"/>
                 <w:szCs w:val="15"/>
               </w:rPr>
-              <w:t xml:space="preserve">  | { status: "VALID";        </w:t>
-            </w:r>
-            <w:proofErr w:type="spellStart"/>
+              <w:t xml:space="preserve">  | </w:t>
+            </w:r>
+            <w:proofErr w:type="gramStart"/>
             <w:r>
               <w:rPr>
                 <w:rFonts w:ascii="Consolas" w:eastAsia="Consolas" w:hAnsi="Consolas" w:cs="Consolas"/>
@@ -12197,6 +12513,46 @@
                 <w:sz w:val="15"/>
                 <w:szCs w:val="15"/>
               </w:rPr>
+              <w:t>{ status</w:t>
+            </w:r>
+            <w:proofErr w:type="gramEnd"/>
+            <w:r>
+              <w:rPr>
+                <w:rFonts w:ascii="Consolas" w:eastAsia="Consolas" w:hAnsi="Consolas" w:cs="Consolas"/>
+                <w:color w:val="DCEFE5"/>
+                <w:sz w:val="15"/>
+                <w:szCs w:val="15"/>
+              </w:rPr>
+              <w:t>: "VALID</w:t>
+            </w:r>
+            <w:proofErr w:type="gramStart"/>
+            <w:r>
+              <w:rPr>
+                <w:rFonts w:ascii="Consolas" w:eastAsia="Consolas" w:hAnsi="Consolas" w:cs="Consolas"/>
+                <w:color w:val="DCEFE5"/>
+                <w:sz w:val="15"/>
+                <w:szCs w:val="15"/>
+              </w:rPr>
+              <w:t xml:space="preserve">";   </w:t>
+            </w:r>
+            <w:proofErr w:type="gramEnd"/>
+            <w:r>
+              <w:rPr>
+                <w:rFonts w:ascii="Consolas" w:eastAsia="Consolas" w:hAnsi="Consolas" w:cs="Consolas"/>
+                <w:color w:val="DCEFE5"/>
+                <w:sz w:val="15"/>
+                <w:szCs w:val="15"/>
+              </w:rPr>
+              <w:t xml:space="preserve">     </w:t>
+            </w:r>
+            <w:proofErr w:type="spellStart"/>
+            <w:r>
+              <w:rPr>
+                <w:rFonts w:ascii="Consolas" w:eastAsia="Consolas" w:hAnsi="Consolas" w:cs="Consolas"/>
+                <w:color w:val="DCEFE5"/>
+                <w:sz w:val="15"/>
+                <w:szCs w:val="15"/>
+              </w:rPr>
               <w:t>branchId</w:t>
             </w:r>
             <w:proofErr w:type="spellEnd"/>
@@ -12247,10 +12603,9 @@
                 <w:sz w:val="15"/>
                 <w:szCs w:val="15"/>
               </w:rPr>
-              <w:t>: number }</w:t>
-            </w:r>
-          </w:p>
-          <w:p>
+              <w:t xml:space="preserve">: </w:t>
+            </w:r>
+            <w:proofErr w:type="gramStart"/>
             <w:r>
               <w:rPr>
                 <w:rFonts w:ascii="Consolas" w:eastAsia="Consolas" w:hAnsi="Consolas" w:cs="Consolas"/>
@@ -12258,9 +12613,11 @@
                 <w:sz w:val="15"/>
                 <w:szCs w:val="15"/>
               </w:rPr>
-              <w:t xml:space="preserve">  | { status: "OUT_OF_RANGE"; </w:t>
-            </w:r>
-            <w:proofErr w:type="spellStart"/>
+              <w:t>number }</w:t>
+            </w:r>
+            <w:proofErr w:type="gramEnd"/>
+          </w:p>
+          <w:p>
             <w:r>
               <w:rPr>
                 <w:rFonts w:ascii="Consolas" w:eastAsia="Consolas" w:hAnsi="Consolas" w:cs="Consolas"/>
@@ -12268,6 +12625,36 @@
                 <w:sz w:val="15"/>
                 <w:szCs w:val="15"/>
               </w:rPr>
+              <w:t xml:space="preserve">  | </w:t>
+            </w:r>
+            <w:proofErr w:type="gramStart"/>
+            <w:r>
+              <w:rPr>
+                <w:rFonts w:ascii="Consolas" w:eastAsia="Consolas" w:hAnsi="Consolas" w:cs="Consolas"/>
+                <w:color w:val="DCEFE5"/>
+                <w:sz w:val="15"/>
+                <w:szCs w:val="15"/>
+              </w:rPr>
+              <w:t>{ status</w:t>
+            </w:r>
+            <w:proofErr w:type="gramEnd"/>
+            <w:r>
+              <w:rPr>
+                <w:rFonts w:ascii="Consolas" w:eastAsia="Consolas" w:hAnsi="Consolas" w:cs="Consolas"/>
+                <w:color w:val="DCEFE5"/>
+                <w:sz w:val="15"/>
+                <w:szCs w:val="15"/>
+              </w:rPr>
+              <w:t xml:space="preserve">: "OUT_OF_RANGE"; </w:t>
+            </w:r>
+            <w:proofErr w:type="spellStart"/>
+            <w:r>
+              <w:rPr>
+                <w:rFonts w:ascii="Consolas" w:eastAsia="Consolas" w:hAnsi="Consolas" w:cs="Consolas"/>
+                <w:color w:val="DCEFE5"/>
+                <w:sz w:val="15"/>
+                <w:szCs w:val="15"/>
+              </w:rPr>
               <w:t>nearestBranchId</w:t>
             </w:r>
             <w:proofErr w:type="spellEnd"/>
@@ -12298,10 +12685,9 @@
                 <w:sz w:val="15"/>
                 <w:szCs w:val="15"/>
               </w:rPr>
-              <w:t>: number | null }</w:t>
-            </w:r>
-          </w:p>
-          <w:p>
+              <w:t xml:space="preserve">: number | </w:t>
+            </w:r>
+            <w:proofErr w:type="gramStart"/>
             <w:r>
               <w:rPr>
                 <w:rFonts w:ascii="Consolas" w:eastAsia="Consolas" w:hAnsi="Consolas" w:cs="Consolas"/>
@@ -12309,9 +12695,11 @@
                 <w:sz w:val="15"/>
                 <w:szCs w:val="15"/>
               </w:rPr>
-              <w:t xml:space="preserve">  | { status: "REJECTED";     reason: </w:t>
-            </w:r>
-            <w:proofErr w:type="spellStart"/>
+              <w:t>null }</w:t>
+            </w:r>
+            <w:proofErr w:type="gramEnd"/>
+          </w:p>
+          <w:p>
             <w:r>
               <w:rPr>
                 <w:rFonts w:ascii="Consolas" w:eastAsia="Consolas" w:hAnsi="Consolas" w:cs="Consolas"/>
@@ -12319,6 +12707,57 @@
                 <w:sz w:val="15"/>
                 <w:szCs w:val="15"/>
               </w:rPr>
+              <w:t xml:space="preserve">  | </w:t>
+            </w:r>
+            <w:proofErr w:type="gramStart"/>
+            <w:r>
+              <w:rPr>
+                <w:rFonts w:ascii="Consolas" w:eastAsia="Consolas" w:hAnsi="Consolas" w:cs="Consolas"/>
+                <w:color w:val="DCEFE5"/>
+                <w:sz w:val="15"/>
+                <w:szCs w:val="15"/>
+              </w:rPr>
+              <w:t>{ status</w:t>
+            </w:r>
+            <w:proofErr w:type="gramEnd"/>
+            <w:r>
+              <w:rPr>
+                <w:rFonts w:ascii="Consolas" w:eastAsia="Consolas" w:hAnsi="Consolas" w:cs="Consolas"/>
+                <w:color w:val="DCEFE5"/>
+                <w:sz w:val="15"/>
+                <w:szCs w:val="15"/>
+              </w:rPr>
+              <w:t>: "REJECTED</w:t>
+            </w:r>
+            <w:proofErr w:type="gramStart"/>
+            <w:r>
+              <w:rPr>
+                <w:rFonts w:ascii="Consolas" w:eastAsia="Consolas" w:hAnsi="Consolas" w:cs="Consolas"/>
+                <w:color w:val="DCEFE5"/>
+                <w:sz w:val="15"/>
+                <w:szCs w:val="15"/>
+              </w:rPr>
+              <w:t xml:space="preserve">";   </w:t>
+            </w:r>
+            <w:proofErr w:type="gramEnd"/>
+            <w:r>
+              <w:rPr>
+                <w:rFonts w:ascii="Consolas" w:eastAsia="Consolas" w:hAnsi="Consolas" w:cs="Consolas"/>
+                <w:color w:val="DCEFE5"/>
+                <w:sz w:val="15"/>
+                <w:szCs w:val="15"/>
+              </w:rPr>
+              <w:t xml:space="preserve">  reason: </w:t>
+            </w:r>
+            <w:proofErr w:type="spellStart"/>
+            <w:proofErr w:type="gramStart"/>
+            <w:r>
+              <w:rPr>
+                <w:rFonts w:ascii="Consolas" w:eastAsia="Consolas" w:hAnsi="Consolas" w:cs="Consolas"/>
+                <w:color w:val="DCEFE5"/>
+                <w:sz w:val="15"/>
+                <w:szCs w:val="15"/>
+              </w:rPr>
               <w:t>RejectReason</w:t>
             </w:r>
             <w:proofErr w:type="spellEnd"/>
@@ -12329,10 +12768,9 @@
                 <w:sz w:val="15"/>
                 <w:szCs w:val="15"/>
               </w:rPr>
-              <w:t xml:space="preserve"> };</w:t>
-            </w:r>
-          </w:p>
-          <w:p>
+              <w:t xml:space="preserve"> }</w:t>
+            </w:r>
+            <w:proofErr w:type="gramEnd"/>
             <w:r>
               <w:rPr>
                 <w:rFonts w:ascii="Consolas" w:eastAsia="Consolas" w:hAnsi="Consolas" w:cs="Consolas"/>
@@ -12340,7 +12778,7 @@
                 <w:sz w:val="15"/>
                 <w:szCs w:val="15"/>
               </w:rPr>
-              <w:t xml:space="preserve"> </w:t>
+              <w:t>;</w:t>
             </w:r>
           </w:p>
           <w:p>
@@ -12351,6 +12789,17 @@
                 <w:sz w:val="15"/>
                 <w:szCs w:val="15"/>
               </w:rPr>
+              <w:t xml:space="preserve"> </w:t>
+            </w:r>
+          </w:p>
+          <w:p>
+            <w:r>
+              <w:rPr>
+                <w:rFonts w:ascii="Consolas" w:eastAsia="Consolas" w:hAnsi="Consolas" w:cs="Consolas"/>
+                <w:color w:val="DCEFE5"/>
+                <w:sz w:val="15"/>
+                <w:szCs w:val="15"/>
+              </w:rPr>
               <w:t xml:space="preserve">type </w:t>
             </w:r>
             <w:proofErr w:type="spellStart"/>
@@ -12396,6 +12845,7 @@
               <w:t xml:space="preserve">export function </w:t>
             </w:r>
             <w:proofErr w:type="spellStart"/>
+            <w:proofErr w:type="gramStart"/>
             <w:r>
               <w:rPr>
                 <w:rFonts w:ascii="Consolas" w:eastAsia="Consolas" w:hAnsi="Consolas" w:cs="Consolas"/>
@@ -12416,6 +12866,7 @@
               <w:t>(</w:t>
             </w:r>
             <w:proofErr w:type="spellStart"/>
+            <w:proofErr w:type="gramEnd"/>
             <w:r>
               <w:rPr>
                 <w:rFonts w:ascii="Consolas" w:eastAsia="Consolas" w:hAnsi="Consolas" w:cs="Consolas"/>
@@ -12453,7 +12904,27 @@
                 <w:sz w:val="15"/>
                 <w:szCs w:val="15"/>
               </w:rPr>
-              <w:t>, branches: Branch[]): Result</w:t>
+              <w:t xml:space="preserve">, branches: </w:t>
+            </w:r>
+            <w:proofErr w:type="gramStart"/>
+            <w:r>
+              <w:rPr>
+                <w:rFonts w:ascii="Consolas" w:eastAsia="Consolas" w:hAnsi="Consolas" w:cs="Consolas"/>
+                <w:color w:val="DCEFE5"/>
+                <w:sz w:val="15"/>
+                <w:szCs w:val="15"/>
+              </w:rPr>
+              <w:t>Branch[</w:t>
+            </w:r>
+            <w:proofErr w:type="gramEnd"/>
+            <w:r>
+              <w:rPr>
+                <w:rFonts w:ascii="Consolas" w:eastAsia="Consolas" w:hAnsi="Consolas" w:cs="Consolas"/>
+                <w:color w:val="DCEFE5"/>
+                <w:sz w:val="15"/>
+                <w:szCs w:val="15"/>
+              </w:rPr>
+              <w:t>]): Result</w:t>
             </w:r>
           </w:p>
         </w:tc>
@@ -13440,9 +13911,18 @@
                 <w:sz w:val="17"/>
                 <w:szCs w:val="17"/>
               </w:rPr>
-              <w:t xml:space="preserve"> + min(</w:t>
-            </w:r>
-            <w:proofErr w:type="spellStart"/>
+              <w:t xml:space="preserve"> + </w:t>
+            </w:r>
+            <w:proofErr w:type="gramStart"/>
+            <w:r>
+              <w:rPr>
+                <w:sz w:val="17"/>
+                <w:szCs w:val="17"/>
+              </w:rPr>
+              <w:t>min(</w:t>
+            </w:r>
+            <w:proofErr w:type="spellStart"/>
+            <w:proofErr w:type="gramEnd"/>
             <w:r>
               <w:rPr>
                 <w:sz w:val="17"/>
@@ -13964,7 +14444,23 @@
                 <w:sz w:val="17"/>
                 <w:szCs w:val="17"/>
               </w:rPr>
-              <w:t xml:space="preserve"> -90..90, </w:t>
+              <w:t xml:space="preserve"> -</w:t>
+            </w:r>
+            <w:proofErr w:type="gramStart"/>
+            <w:r>
+              <w:rPr>
+                <w:sz w:val="17"/>
+                <w:szCs w:val="17"/>
+              </w:rPr>
+              <w:t>90..</w:t>
+            </w:r>
+            <w:proofErr w:type="gramEnd"/>
+            <w:r>
+              <w:rPr>
+                <w:sz w:val="17"/>
+                <w:szCs w:val="17"/>
+              </w:rPr>
+              <w:t xml:space="preserve">90, </w:t>
             </w:r>
             <w:proofErr w:type="spellStart"/>
             <w:r>
@@ -13996,7 +14492,23 @@
                 <w:sz w:val="17"/>
                 <w:szCs w:val="17"/>
               </w:rPr>
-              <w:t xml:space="preserve"> -180..180), </w:t>
+              <w:t xml:space="preserve"> -</w:t>
+            </w:r>
+            <w:proofErr w:type="gramStart"/>
+            <w:r>
+              <w:rPr>
+                <w:sz w:val="17"/>
+                <w:szCs w:val="17"/>
+              </w:rPr>
+              <w:t>180..</w:t>
+            </w:r>
+            <w:proofErr w:type="gramEnd"/>
+            <w:r>
+              <w:rPr>
+                <w:sz w:val="17"/>
+                <w:szCs w:val="17"/>
+              </w:rPr>
+              <w:t xml:space="preserve">180), </w:t>
             </w:r>
             <w:proofErr w:type="spellStart"/>
             <w:r>
@@ -14771,10 +15283,9 @@
                 <w:sz w:val="15"/>
                 <w:szCs w:val="15"/>
               </w:rPr>
-              <w:t>const branches: Branch[] = [</w:t>
-            </w:r>
-          </w:p>
-          <w:p>
+              <w:t xml:space="preserve">const branches: </w:t>
+            </w:r>
+            <w:proofErr w:type="gramStart"/>
             <w:r>
               <w:rPr>
                 <w:rFonts w:ascii="Consolas" w:eastAsia="Consolas" w:hAnsi="Consolas" w:cs="Consolas"/>
@@ -14782,9 +15293,9 @@
                 <w:sz w:val="15"/>
                 <w:szCs w:val="15"/>
               </w:rPr>
-              <w:t xml:space="preserve">  { id: "B-01", name: "</w:t>
-            </w:r>
-            <w:proofErr w:type="spellStart"/>
+              <w:t>Branch[</w:t>
+            </w:r>
+            <w:proofErr w:type="gramEnd"/>
             <w:r>
               <w:rPr>
                 <w:rFonts w:ascii="Consolas" w:eastAsia="Consolas" w:hAnsi="Consolas" w:cs="Consolas"/>
@@ -14792,6 +15303,47 @@
                 <w:sz w:val="15"/>
                 <w:szCs w:val="15"/>
               </w:rPr>
+              <w:t>] = [</w:t>
+            </w:r>
+          </w:p>
+          <w:p>
+            <w:r>
+              <w:rPr>
+                <w:rFonts w:ascii="Consolas" w:eastAsia="Consolas" w:hAnsi="Consolas" w:cs="Consolas"/>
+                <w:color w:val="14201B"/>
+                <w:sz w:val="15"/>
+                <w:szCs w:val="15"/>
+              </w:rPr>
+              <w:t xml:space="preserve">  </w:t>
+            </w:r>
+            <w:proofErr w:type="gramStart"/>
+            <w:r>
+              <w:rPr>
+                <w:rFonts w:ascii="Consolas" w:eastAsia="Consolas" w:hAnsi="Consolas" w:cs="Consolas"/>
+                <w:color w:val="14201B"/>
+                <w:sz w:val="15"/>
+                <w:szCs w:val="15"/>
+              </w:rPr>
+              <w:t>{ id</w:t>
+            </w:r>
+            <w:proofErr w:type="gramEnd"/>
+            <w:r>
+              <w:rPr>
+                <w:rFonts w:ascii="Consolas" w:eastAsia="Consolas" w:hAnsi="Consolas" w:cs="Consolas"/>
+                <w:color w:val="14201B"/>
+                <w:sz w:val="15"/>
+                <w:szCs w:val="15"/>
+              </w:rPr>
+              <w:t>: "B-01", name: "</w:t>
+            </w:r>
+            <w:proofErr w:type="spellStart"/>
+            <w:r>
+              <w:rPr>
+                <w:rFonts w:ascii="Consolas" w:eastAsia="Consolas" w:hAnsi="Consolas" w:cs="Consolas"/>
+                <w:color w:val="14201B"/>
+                <w:sz w:val="15"/>
+                <w:szCs w:val="15"/>
+              </w:rPr>
               <w:t>Kemayoran</w:t>
             </w:r>
             <w:proofErr w:type="spellEnd"/>
@@ -14862,10 +15414,9 @@
                 <w:sz w:val="15"/>
                 <w:szCs w:val="15"/>
               </w:rPr>
-              <w:t>: 150, active: true },</w:t>
-            </w:r>
-          </w:p>
-          <w:p>
+              <w:t xml:space="preserve">: 150, active: </w:t>
+            </w:r>
+            <w:proofErr w:type="gramStart"/>
             <w:r>
               <w:rPr>
                 <w:rFonts w:ascii="Consolas" w:eastAsia="Consolas" w:hAnsi="Consolas" w:cs="Consolas"/>
@@ -14873,9 +15424,9 @@
                 <w:sz w:val="15"/>
                 <w:szCs w:val="15"/>
               </w:rPr>
-              <w:t xml:space="preserve">  { id: "B-02", name: "Sunter",    </w:t>
-            </w:r>
-            <w:proofErr w:type="spellStart"/>
+              <w:t>true }</w:t>
+            </w:r>
+            <w:proofErr w:type="gramEnd"/>
             <w:r>
               <w:rPr>
                 <w:rFonts w:ascii="Consolas" w:eastAsia="Consolas" w:hAnsi="Consolas" w:cs="Consolas"/>
@@ -14883,6 +15434,67 @@
                 <w:sz w:val="15"/>
                 <w:szCs w:val="15"/>
               </w:rPr>
+              <w:t>,</w:t>
+            </w:r>
+          </w:p>
+          <w:p>
+            <w:r>
+              <w:rPr>
+                <w:rFonts w:ascii="Consolas" w:eastAsia="Consolas" w:hAnsi="Consolas" w:cs="Consolas"/>
+                <w:color w:val="14201B"/>
+                <w:sz w:val="15"/>
+                <w:szCs w:val="15"/>
+              </w:rPr>
+              <w:t xml:space="preserve">  </w:t>
+            </w:r>
+            <w:proofErr w:type="gramStart"/>
+            <w:r>
+              <w:rPr>
+                <w:rFonts w:ascii="Consolas" w:eastAsia="Consolas" w:hAnsi="Consolas" w:cs="Consolas"/>
+                <w:color w:val="14201B"/>
+                <w:sz w:val="15"/>
+                <w:szCs w:val="15"/>
+              </w:rPr>
+              <w:t>{ id</w:t>
+            </w:r>
+            <w:proofErr w:type="gramEnd"/>
+            <w:r>
+              <w:rPr>
+                <w:rFonts w:ascii="Consolas" w:eastAsia="Consolas" w:hAnsi="Consolas" w:cs="Consolas"/>
+                <w:color w:val="14201B"/>
+                <w:sz w:val="15"/>
+                <w:szCs w:val="15"/>
+              </w:rPr>
+              <w:t>: "B-02", name: "Sunter</w:t>
+            </w:r>
+            <w:proofErr w:type="gramStart"/>
+            <w:r>
+              <w:rPr>
+                <w:rFonts w:ascii="Consolas" w:eastAsia="Consolas" w:hAnsi="Consolas" w:cs="Consolas"/>
+                <w:color w:val="14201B"/>
+                <w:sz w:val="15"/>
+                <w:szCs w:val="15"/>
+              </w:rPr>
+              <w:t xml:space="preserve">",   </w:t>
+            </w:r>
+            <w:proofErr w:type="gramEnd"/>
+            <w:r>
+              <w:rPr>
+                <w:rFonts w:ascii="Consolas" w:eastAsia="Consolas" w:hAnsi="Consolas" w:cs="Consolas"/>
+                <w:color w:val="14201B"/>
+                <w:sz w:val="15"/>
+                <w:szCs w:val="15"/>
+              </w:rPr>
+              <w:t xml:space="preserve"> </w:t>
+            </w:r>
+            <w:proofErr w:type="spellStart"/>
+            <w:r>
+              <w:rPr>
+                <w:rFonts w:ascii="Consolas" w:eastAsia="Consolas" w:hAnsi="Consolas" w:cs="Consolas"/>
+                <w:color w:val="14201B"/>
+                <w:sz w:val="15"/>
+                <w:szCs w:val="15"/>
+              </w:rPr>
               <w:t>lat</w:t>
             </w:r>
             <w:proofErr w:type="spellEnd"/>
@@ -14933,10 +15545,9 @@
                 <w:sz w:val="15"/>
                 <w:szCs w:val="15"/>
               </w:rPr>
-              <w:t>: 200, active: true },</w:t>
-            </w:r>
-          </w:p>
-          <w:p>
+              <w:t xml:space="preserve">: 200, active: </w:t>
+            </w:r>
+            <w:proofErr w:type="gramStart"/>
             <w:r>
               <w:rPr>
                 <w:rFonts w:ascii="Consolas" w:eastAsia="Consolas" w:hAnsi="Consolas" w:cs="Consolas"/>
@@ -14944,9 +15555,9 @@
                 <w:sz w:val="15"/>
                 <w:szCs w:val="15"/>
               </w:rPr>
-              <w:t xml:space="preserve">  { id: "B-03", name: "</w:t>
-            </w:r>
-            <w:proofErr w:type="spellStart"/>
+              <w:t>true }</w:t>
+            </w:r>
+            <w:proofErr w:type="gramEnd"/>
             <w:r>
               <w:rPr>
                 <w:rFonts w:ascii="Consolas" w:eastAsia="Consolas" w:hAnsi="Consolas" w:cs="Consolas"/>
@@ -14954,9 +15565,51 @@
                 <w:sz w:val="15"/>
                 <w:szCs w:val="15"/>
               </w:rPr>
+              <w:t>,</w:t>
+            </w:r>
+          </w:p>
+          <w:p>
+            <w:r>
+              <w:rPr>
+                <w:rFonts w:ascii="Consolas" w:eastAsia="Consolas" w:hAnsi="Consolas" w:cs="Consolas"/>
+                <w:color w:val="14201B"/>
+                <w:sz w:val="15"/>
+                <w:szCs w:val="15"/>
+              </w:rPr>
+              <w:t xml:space="preserve">  </w:t>
+            </w:r>
+            <w:proofErr w:type="gramStart"/>
+            <w:r>
+              <w:rPr>
+                <w:rFonts w:ascii="Consolas" w:eastAsia="Consolas" w:hAnsi="Consolas" w:cs="Consolas"/>
+                <w:color w:val="14201B"/>
+                <w:sz w:val="15"/>
+                <w:szCs w:val="15"/>
+              </w:rPr>
+              <w:t>{ id</w:t>
+            </w:r>
+            <w:proofErr w:type="gramEnd"/>
+            <w:r>
+              <w:rPr>
+                <w:rFonts w:ascii="Consolas" w:eastAsia="Consolas" w:hAnsi="Consolas" w:cs="Consolas"/>
+                <w:color w:val="14201B"/>
+                <w:sz w:val="15"/>
+                <w:szCs w:val="15"/>
+              </w:rPr>
+              <w:t>: "B-03", name: "</w:t>
+            </w:r>
+            <w:proofErr w:type="spellStart"/>
+            <w:r>
+              <w:rPr>
+                <w:rFonts w:ascii="Consolas" w:eastAsia="Consolas" w:hAnsi="Consolas" w:cs="Consolas"/>
+                <w:color w:val="14201B"/>
+                <w:sz w:val="15"/>
+                <w:szCs w:val="15"/>
+              </w:rPr>
               <w:t>Cakung</w:t>
             </w:r>
             <w:proofErr w:type="spellEnd"/>
+            <w:proofErr w:type="gramStart"/>
             <w:r>
               <w:rPr>
                 <w:rFonts w:ascii="Consolas" w:eastAsia="Consolas" w:hAnsi="Consolas" w:cs="Consolas"/>
@@ -14964,9 +15617,9 @@
                 <w:sz w:val="15"/>
                 <w:szCs w:val="15"/>
               </w:rPr>
-              <w:t xml:space="preserve">",    </w:t>
-            </w:r>
-            <w:proofErr w:type="spellStart"/>
+              <w:t xml:space="preserve">",   </w:t>
+            </w:r>
+            <w:proofErr w:type="gramEnd"/>
             <w:r>
               <w:rPr>
                 <w:rFonts w:ascii="Consolas" w:eastAsia="Consolas" w:hAnsi="Consolas" w:cs="Consolas"/>
@@ -14974,6 +15627,16 @@
                 <w:sz w:val="15"/>
                 <w:szCs w:val="15"/>
               </w:rPr>
+              <w:t xml:space="preserve"> </w:t>
+            </w:r>
+            <w:proofErr w:type="spellStart"/>
+            <w:r>
+              <w:rPr>
+                <w:rFonts w:ascii="Consolas" w:eastAsia="Consolas" w:hAnsi="Consolas" w:cs="Consolas"/>
+                <w:color w:val="14201B"/>
+                <w:sz w:val="15"/>
+                <w:szCs w:val="15"/>
+              </w:rPr>
               <w:t>lat</w:t>
             </w:r>
             <w:proofErr w:type="spellEnd"/>
@@ -15024,7 +15687,27 @@
                 <w:sz w:val="15"/>
                 <w:szCs w:val="15"/>
               </w:rPr>
-              <w:t>: 120, active: false },</w:t>
+              <w:t xml:space="preserve">: 120, active: </w:t>
+            </w:r>
+            <w:proofErr w:type="gramStart"/>
+            <w:r>
+              <w:rPr>
+                <w:rFonts w:ascii="Consolas" w:eastAsia="Consolas" w:hAnsi="Consolas" w:cs="Consolas"/>
+                <w:color w:val="14201B"/>
+                <w:sz w:val="15"/>
+                <w:szCs w:val="15"/>
+              </w:rPr>
+              <w:t>false }</w:t>
+            </w:r>
+            <w:proofErr w:type="gramEnd"/>
+            <w:r>
+              <w:rPr>
+                <w:rFonts w:ascii="Consolas" w:eastAsia="Consolas" w:hAnsi="Consolas" w:cs="Consolas"/>
+                <w:color w:val="14201B"/>
+                <w:sz w:val="15"/>
+                <w:szCs w:val="15"/>
+              </w:rPr>
+              <w:t>,</w:t>
             </w:r>
           </w:p>
           <w:p>
@@ -15880,7 +16563,15 @@
         <w:spacing w:after="60" w:line="280" w:lineRule="auto"/>
       </w:pPr>
       <w:r>
-        <w:t>Minimal 10 unit test (</w:t>
+        <w:t xml:space="preserve">Minimal </w:t>
+      </w:r>
+      <w:proofErr w:type="gramStart"/>
+      <w:r>
+        <w:t>10 unit</w:t>
+      </w:r>
+      <w:proofErr w:type="gramEnd"/>
+      <w:r>
+        <w:t xml:space="preserve"> test (</w:t>
       </w:r>
       <w:proofErr w:type="spellStart"/>
       <w:r>
@@ -16507,7 +17198,15 @@
               <w:ind w:left="720"/>
             </w:pPr>
             <w:r>
-              <w:t xml:space="preserve">Trade-off : </w:t>
+              <w:t>Trade-</w:t>
+            </w:r>
+            <w:proofErr w:type="gramStart"/>
+            <w:r>
+              <w:t>off :</w:t>
+            </w:r>
+            <w:proofErr w:type="gramEnd"/>
+            <w:r>
+              <w:t xml:space="preserve"> </w:t>
             </w:r>
             <w:proofErr w:type="spellStart"/>
             <w:r>
@@ -16892,21 +17591,31 @@
             </w:r>
             <w:proofErr w:type="spellStart"/>
             <w:r>
-              <w:t>ST_Distance</w:t>
+              <w:t>ST_</w:t>
+            </w:r>
+            <w:proofErr w:type="gramStart"/>
+            <w:r>
+              <w:t>Distance</w:t>
             </w:r>
             <w:proofErr w:type="spellEnd"/>
             <w:r>
               <w:t>(</w:t>
             </w:r>
             <w:proofErr w:type="spellStart"/>
-            <w:r>
-              <w:t>ST_SetSRID</w:t>
+            <w:proofErr w:type="gramEnd"/>
+            <w:r>
+              <w:t>ST_</w:t>
+            </w:r>
+            <w:proofErr w:type="gramStart"/>
+            <w:r>
+              <w:t>SetSRID</w:t>
             </w:r>
             <w:proofErr w:type="spellEnd"/>
             <w:r>
               <w:t>(</w:t>
             </w:r>
             <w:proofErr w:type="spellStart"/>
+            <w:proofErr w:type="gramEnd"/>
             <w:r>
               <w:t>ST_MakePoint</w:t>
             </w:r>
@@ -16915,12 +17624,22 @@
               <w:t>(</w:t>
             </w:r>
             <w:proofErr w:type="spellStart"/>
+            <w:proofErr w:type="gramStart"/>
             <w:r>
               <w:t>lng,lat</w:t>
             </w:r>
             <w:proofErr w:type="spellEnd"/>
-            <w:r>
-              <w:t>), 4326)::geography</w:t>
+            <w:proofErr w:type="gramEnd"/>
+            <w:r>
+              <w:t>), 4326</w:t>
+            </w:r>
+            <w:proofErr w:type="gramStart"/>
+            <w:r>
+              <w:t>)::</w:t>
+            </w:r>
+            <w:proofErr w:type="gramEnd"/>
+            <w:r>
+              <w:t>geography</w:t>
             </w:r>
           </w:p>
           <w:p>
@@ -16929,13 +17648,18 @@
             </w:r>
             <w:proofErr w:type="spellStart"/>
             <w:r>
-              <w:t>ST_SetSRID</w:t>
+              <w:t>ST_</w:t>
+            </w:r>
+            <w:proofErr w:type="gramStart"/>
+            <w:r>
+              <w:t>SetSRID</w:t>
             </w:r>
             <w:proofErr w:type="spellEnd"/>
             <w:r>
               <w:t>(</w:t>
             </w:r>
             <w:proofErr w:type="spellStart"/>
+            <w:proofErr w:type="gramEnd"/>
             <w:r>
               <w:t>ST_MakePoint</w:t>
             </w:r>
@@ -16945,11 +17669,27 @@
             </w:r>
             <w:proofErr w:type="spellStart"/>
             <w:r>
-              <w:t>check_lng,check_lat</w:t>
-            </w:r>
-            <w:proofErr w:type="spellEnd"/>
-            <w:r>
-              <w:t>), 4326)::geography ) AS distance</w:t>
+              <w:t>check_</w:t>
+            </w:r>
+            <w:proofErr w:type="gramStart"/>
+            <w:r>
+              <w:t>lng,check</w:t>
+            </w:r>
+            <w:proofErr w:type="gramEnd"/>
+            <w:r>
+              <w:t>_lat</w:t>
+            </w:r>
+            <w:proofErr w:type="spellEnd"/>
+            <w:r>
+              <w:t>), 4326</w:t>
+            </w:r>
+            <w:proofErr w:type="gramStart"/>
+            <w:r>
+              <w:t>)::geography )</w:t>
+            </w:r>
+            <w:proofErr w:type="gramEnd"/>
+            <w:r>
+              <w:t xml:space="preserve"> AS distance</w:t>
             </w:r>
           </w:p>
           <w:p>
@@ -16958,8 +17698,13 @@
             </w:r>
           </w:p>
           <w:p>
-            <w:r>
-              <w:t xml:space="preserve">WHERE  </w:t>
+            <w:proofErr w:type="gramStart"/>
+            <w:r>
+              <w:t>WHERE</w:t>
+            </w:r>
+            <w:proofErr w:type="gramEnd"/>
+            <w:r>
+              <w:t xml:space="preserve">  </w:t>
             </w:r>
           </w:p>
           <w:p>
@@ -16976,21 +17721,31 @@
             </w:r>
             <w:proofErr w:type="spellStart"/>
             <w:r>
-              <w:t>ST_DWithin</w:t>
+              <w:t>ST_</w:t>
+            </w:r>
+            <w:proofErr w:type="gramStart"/>
+            <w:r>
+              <w:t>DWithin</w:t>
             </w:r>
             <w:proofErr w:type="spellEnd"/>
             <w:r>
               <w:t>(</w:t>
             </w:r>
             <w:proofErr w:type="spellStart"/>
-            <w:r>
-              <w:t>ST_SetSRID</w:t>
+            <w:proofErr w:type="gramEnd"/>
+            <w:r>
+              <w:t>ST_</w:t>
+            </w:r>
+            <w:proofErr w:type="gramStart"/>
+            <w:r>
+              <w:t>SetSRID</w:t>
             </w:r>
             <w:proofErr w:type="spellEnd"/>
             <w:r>
               <w:t>(</w:t>
             </w:r>
             <w:proofErr w:type="spellStart"/>
+            <w:proofErr w:type="gramEnd"/>
             <w:r>
               <w:t>ST_MakePoint</w:t>
             </w:r>
@@ -16999,24 +17754,39 @@
               <w:t>(</w:t>
             </w:r>
             <w:proofErr w:type="spellStart"/>
+            <w:proofErr w:type="gramStart"/>
             <w:r>
               <w:t>lng,lat</w:t>
             </w:r>
             <w:proofErr w:type="spellEnd"/>
-            <w:r>
-              <w:t>),4326)::geography,</w:t>
-            </w:r>
-          </w:p>
-          <w:p>
-            <w:proofErr w:type="spellStart"/>
-            <w:r>
-              <w:t>ST_SetSRID</w:t>
+            <w:proofErr w:type="gramEnd"/>
+            <w:r>
+              <w:t>),4326</w:t>
+            </w:r>
+            <w:proofErr w:type="gramStart"/>
+            <w:r>
+              <w:t>)::</w:t>
+            </w:r>
+            <w:proofErr w:type="gramEnd"/>
+            <w:r>
+              <w:t>geography,</w:t>
+            </w:r>
+          </w:p>
+          <w:p>
+            <w:proofErr w:type="spellStart"/>
+            <w:r>
+              <w:t>ST_</w:t>
+            </w:r>
+            <w:proofErr w:type="gramStart"/>
+            <w:r>
+              <w:t>SetSRID</w:t>
             </w:r>
             <w:proofErr w:type="spellEnd"/>
             <w:r>
               <w:t>(</w:t>
             </w:r>
             <w:proofErr w:type="spellStart"/>
+            <w:proofErr w:type="gramEnd"/>
             <w:r>
               <w:t>ST_MakePoint</w:t>
             </w:r>
@@ -17026,21 +17796,45 @@
             </w:r>
             <w:proofErr w:type="spellStart"/>
             <w:r>
-              <w:t>check_lng,check_lat</w:t>
-            </w:r>
-            <w:proofErr w:type="spellEnd"/>
-            <w:r>
-              <w:t>),4326)::geography,</w:t>
-            </w:r>
-          </w:p>
-          <w:p>
-            <w:proofErr w:type="spellStart"/>
-            <w:r>
-              <w:t>radiusM+LEAST</w:t>
-            </w:r>
-            <w:proofErr w:type="spellEnd"/>
-            <w:r>
-              <w:t>(accuracyM,30))</w:t>
+              <w:t>check_</w:t>
+            </w:r>
+            <w:proofErr w:type="gramStart"/>
+            <w:r>
+              <w:t>lng,check</w:t>
+            </w:r>
+            <w:proofErr w:type="gramEnd"/>
+            <w:r>
+              <w:t>_lat</w:t>
+            </w:r>
+            <w:proofErr w:type="spellEnd"/>
+            <w:r>
+              <w:t>),4326</w:t>
+            </w:r>
+            <w:proofErr w:type="gramStart"/>
+            <w:r>
+              <w:t>)::</w:t>
+            </w:r>
+            <w:proofErr w:type="gramEnd"/>
+            <w:r>
+              <w:t>geography,</w:t>
+            </w:r>
+          </w:p>
+          <w:p>
+            <w:proofErr w:type="spellStart"/>
+            <w:r>
+              <w:t>radiusM+</w:t>
+            </w:r>
+            <w:proofErr w:type="gramStart"/>
+            <w:r>
+              <w:t>LEAST</w:t>
+            </w:r>
+            <w:proofErr w:type="spellEnd"/>
+            <w:r>
+              <w:t>(</w:t>
+            </w:r>
+            <w:proofErr w:type="gramEnd"/>
+            <w:r>
+              <w:t>accuracyM,30))</w:t>
             </w:r>
           </w:p>
           <w:p>
@@ -17059,12 +17853,17 @@
               <w:t xml:space="preserve">index yang </w:t>
             </w:r>
             <w:proofErr w:type="spellStart"/>
+            <w:proofErr w:type="gramStart"/>
             <w:r>
               <w:t>dibuat</w:t>
             </w:r>
             <w:proofErr w:type="spellEnd"/>
             <w:r>
-              <w:t xml:space="preserve"> : </w:t>
+              <w:t xml:space="preserve"> :</w:t>
+            </w:r>
+            <w:proofErr w:type="gramEnd"/>
+            <w:r>
+              <w:t xml:space="preserve"> </w:t>
             </w:r>
           </w:p>
           <w:p>
@@ -17083,7 +17882,15 @@
           <w:p/>
           <w:p>
             <w:r>
-              <w:t xml:space="preserve">Trade-off : </w:t>
+              <w:t>Trade-</w:t>
+            </w:r>
+            <w:proofErr w:type="gramStart"/>
+            <w:r>
+              <w:t>off :</w:t>
+            </w:r>
+            <w:proofErr w:type="gramEnd"/>
+            <w:r>
+              <w:t xml:space="preserve"> </w:t>
             </w:r>
             <w:proofErr w:type="spellStart"/>
             <w:r>
@@ -17192,7 +17999,29 @@
           <w:szCs w:val="30"/>
         </w:rPr>
         <w:lastRenderedPageBreak/>
-        <w:t xml:space="preserve">Bagian C — Code Review &amp; Security  (20 </w:t>
+        <w:t xml:space="preserve">Bagian C — Code Review &amp; </w:t>
+      </w:r>
+      <w:proofErr w:type="gramStart"/>
+      <w:r>
+        <w:rPr>
+          <w:b/>
+          <w:bCs/>
+          <w:color w:val="0B3D2E"/>
+          <w:sz w:val="30"/>
+          <w:szCs w:val="30"/>
+        </w:rPr>
+        <w:t>Security  (</w:t>
+      </w:r>
+      <w:proofErr w:type="gramEnd"/>
+      <w:r>
+        <w:rPr>
+          <w:b/>
+          <w:bCs/>
+          <w:color w:val="0B3D2E"/>
+          <w:sz w:val="30"/>
+          <w:szCs w:val="30"/>
+        </w:rPr>
+        <w:t xml:space="preserve">20 </w:t>
       </w:r>
       <w:proofErr w:type="spellStart"/>
       <w:r>
@@ -17354,7 +18183,29 @@
           <w:sz w:val="23"/>
           <w:szCs w:val="23"/>
         </w:rPr>
-        <w:t xml:space="preserve">C1. Frontend   (10 </w:t>
+        <w:t>C1. Frontend</w:t>
+      </w:r>
+      <w:proofErr w:type="gramStart"/>
+      <w:r>
+        <w:rPr>
+          <w:b/>
+          <w:bCs/>
+          <w:color w:val="14543E"/>
+          <w:sz w:val="23"/>
+          <w:szCs w:val="23"/>
+        </w:rPr>
+        <w:t xml:space="preserve">   (</w:t>
+      </w:r>
+      <w:proofErr w:type="gramEnd"/>
+      <w:r>
+        <w:rPr>
+          <w:b/>
+          <w:bCs/>
+          <w:color w:val="14543E"/>
+          <w:sz w:val="23"/>
+          <w:szCs w:val="23"/>
+        </w:rPr>
+        <w:t xml:space="preserve">10 </w:t>
       </w:r>
       <w:proofErr w:type="spellStart"/>
       <w:r>
@@ -17425,10 +18276,9 @@
                 <w:sz w:val="15"/>
                 <w:szCs w:val="15"/>
               </w:rPr>
-              <w:t>"use client";</w:t>
-            </w:r>
-          </w:p>
-          <w:p>
+              <w:t>"</w:t>
+            </w:r>
+            <w:proofErr w:type="gramStart"/>
             <w:r>
               <w:rPr>
                 <w:rFonts w:ascii="Consolas" w:eastAsia="Consolas" w:hAnsi="Consolas" w:cs="Consolas"/>
@@ -17436,10 +18286,9 @@
                 <w:sz w:val="15"/>
                 <w:szCs w:val="15"/>
               </w:rPr>
-              <w:t xml:space="preserve"> </w:t>
-            </w:r>
-          </w:p>
-          <w:p>
+              <w:t>use</w:t>
+            </w:r>
+            <w:proofErr w:type="gramEnd"/>
             <w:r>
               <w:rPr>
                 <w:rFonts w:ascii="Consolas" w:eastAsia="Consolas" w:hAnsi="Consolas" w:cs="Consolas"/>
@@ -17447,9 +18296,32 @@
                 <w:sz w:val="15"/>
                 <w:szCs w:val="15"/>
               </w:rPr>
+              <w:t xml:space="preserve"> client";</w:t>
+            </w:r>
+          </w:p>
+          <w:p>
+            <w:r>
+              <w:rPr>
+                <w:rFonts w:ascii="Consolas" w:eastAsia="Consolas" w:hAnsi="Consolas" w:cs="Consolas"/>
+                <w:color w:val="DCEFE5"/>
+                <w:sz w:val="15"/>
+                <w:szCs w:val="15"/>
+              </w:rPr>
+              <w:t xml:space="preserve"> </w:t>
+            </w:r>
+          </w:p>
+          <w:p>
+            <w:r>
+              <w:rPr>
+                <w:rFonts w:ascii="Consolas" w:eastAsia="Consolas" w:hAnsi="Consolas" w:cs="Consolas"/>
+                <w:color w:val="DCEFE5"/>
+                <w:sz w:val="15"/>
+                <w:szCs w:val="15"/>
+              </w:rPr>
               <w:t xml:space="preserve">export default function </w:t>
             </w:r>
             <w:proofErr w:type="spellStart"/>
+            <w:proofErr w:type="gramStart"/>
             <w:r>
               <w:rPr>
                 <w:rFonts w:ascii="Consolas" w:eastAsia="Consolas" w:hAnsi="Consolas" w:cs="Consolas"/>
@@ -17480,6 +18352,7 @@
               <w:t>branchId</w:t>
             </w:r>
             <w:proofErr w:type="spellEnd"/>
+            <w:proofErr w:type="gramEnd"/>
             <w:r>
               <w:rPr>
                 <w:rFonts w:ascii="Consolas" w:eastAsia="Consolas" w:hAnsi="Consolas" w:cs="Consolas"/>
@@ -17487,9 +18360,9 @@
                 <w:sz w:val="15"/>
                 <w:szCs w:val="15"/>
               </w:rPr>
-              <w:t xml:space="preserve"> }: { </w:t>
-            </w:r>
-            <w:proofErr w:type="spellStart"/>
+              <w:t xml:space="preserve"> }: </w:t>
+            </w:r>
+            <w:proofErr w:type="gramStart"/>
             <w:r>
               <w:rPr>
                 <w:rFonts w:ascii="Consolas" w:eastAsia="Consolas" w:hAnsi="Consolas" w:cs="Consolas"/>
@@ -17497,9 +18370,20 @@
                 <w:sz w:val="15"/>
                 <w:szCs w:val="15"/>
               </w:rPr>
+              <w:t xml:space="preserve">{ </w:t>
+            </w:r>
+            <w:proofErr w:type="spellStart"/>
+            <w:r>
+              <w:rPr>
+                <w:rFonts w:ascii="Consolas" w:eastAsia="Consolas" w:hAnsi="Consolas" w:cs="Consolas"/>
+                <w:color w:val="DCEFE5"/>
+                <w:sz w:val="15"/>
+                <w:szCs w:val="15"/>
+              </w:rPr>
               <w:t>branchId</w:t>
             </w:r>
             <w:proofErr w:type="spellEnd"/>
+            <w:proofErr w:type="gramEnd"/>
             <w:r>
               <w:rPr>
                 <w:rFonts w:ascii="Consolas" w:eastAsia="Consolas" w:hAnsi="Consolas" w:cs="Consolas"/>
@@ -17507,10 +18391,9 @@
                 <w:sz w:val="15"/>
                 <w:szCs w:val="15"/>
               </w:rPr>
-              <w:t>: string }) {</w:t>
-            </w:r>
-          </w:p>
-          <w:p>
+              <w:t xml:space="preserve">: </w:t>
+            </w:r>
+            <w:proofErr w:type="gramStart"/>
             <w:r>
               <w:rPr>
                 <w:rFonts w:ascii="Consolas" w:eastAsia="Consolas" w:hAnsi="Consolas" w:cs="Consolas"/>
@@ -17518,6 +18401,27 @@
                 <w:sz w:val="15"/>
                 <w:szCs w:val="15"/>
               </w:rPr>
+              <w:t>string }</w:t>
+            </w:r>
+            <w:proofErr w:type="gramEnd"/>
+            <w:r>
+              <w:rPr>
+                <w:rFonts w:ascii="Consolas" w:eastAsia="Consolas" w:hAnsi="Consolas" w:cs="Consolas"/>
+                <w:color w:val="DCEFE5"/>
+                <w:sz w:val="15"/>
+                <w:szCs w:val="15"/>
+              </w:rPr>
+              <w:t>) {</w:t>
+            </w:r>
+          </w:p>
+          <w:p>
+            <w:r>
+              <w:rPr>
+                <w:rFonts w:ascii="Consolas" w:eastAsia="Consolas" w:hAnsi="Consolas" w:cs="Consolas"/>
+                <w:color w:val="DCEFE5"/>
+                <w:sz w:val="15"/>
+                <w:szCs w:val="15"/>
+              </w:rPr>
               <w:t xml:space="preserve">  const [orders, </w:t>
             </w:r>
             <w:proofErr w:type="spellStart"/>
@@ -17541,6 +18445,7 @@
               <w:t xml:space="preserve">] = </w:t>
             </w:r>
             <w:proofErr w:type="spellStart"/>
+            <w:proofErr w:type="gramStart"/>
             <w:r>
               <w:rPr>
                 <w:rFonts w:ascii="Consolas" w:eastAsia="Consolas" w:hAnsi="Consolas" w:cs="Consolas"/>
@@ -17558,10 +18463,9 @@
                 <w:sz w:val="15"/>
                 <w:szCs w:val="15"/>
               </w:rPr>
-              <w:t>([]);</w:t>
-            </w:r>
-          </w:p>
-          <w:p>
+              <w:t>(</w:t>
+            </w:r>
+            <w:proofErr w:type="gramEnd"/>
             <w:r>
               <w:rPr>
                 <w:rFonts w:ascii="Consolas" w:eastAsia="Consolas" w:hAnsi="Consolas" w:cs="Consolas"/>
@@ -17569,9 +18473,21 @@
                 <w:sz w:val="15"/>
                 <w:szCs w:val="15"/>
               </w:rPr>
+              <w:t>[]);</w:t>
+            </w:r>
+          </w:p>
+          <w:p>
+            <w:r>
+              <w:rPr>
+                <w:rFonts w:ascii="Consolas" w:eastAsia="Consolas" w:hAnsi="Consolas" w:cs="Consolas"/>
+                <w:color w:val="DCEFE5"/>
+                <w:sz w:val="15"/>
+                <w:szCs w:val="15"/>
+              </w:rPr>
               <w:t xml:space="preserve">  const [query, </w:t>
             </w:r>
             <w:proofErr w:type="spellStart"/>
+            <w:proofErr w:type="gramStart"/>
             <w:r>
               <w:rPr>
                 <w:rFonts w:ascii="Consolas" w:eastAsia="Consolas" w:hAnsi="Consolas" w:cs="Consolas"/>
@@ -17589,9 +18505,9 @@
                 <w:sz w:val="15"/>
                 <w:szCs w:val="15"/>
               </w:rPr>
-              <w:t xml:space="preserve">]   = </w:t>
-            </w:r>
-            <w:proofErr w:type="spellStart"/>
+              <w:t xml:space="preserve">]   </w:t>
+            </w:r>
+            <w:proofErr w:type="gramEnd"/>
             <w:r>
               <w:rPr>
                 <w:rFonts w:ascii="Consolas" w:eastAsia="Consolas" w:hAnsi="Consolas" w:cs="Consolas"/>
@@ -17599,6 +18515,17 @@
                 <w:sz w:val="15"/>
                 <w:szCs w:val="15"/>
               </w:rPr>
+              <w:t xml:space="preserve">= </w:t>
+            </w:r>
+            <w:proofErr w:type="spellStart"/>
+            <w:proofErr w:type="gramStart"/>
+            <w:r>
+              <w:rPr>
+                <w:rFonts w:ascii="Consolas" w:eastAsia="Consolas" w:hAnsi="Consolas" w:cs="Consolas"/>
+                <w:color w:val="DCEFE5"/>
+                <w:sz w:val="15"/>
+                <w:szCs w:val="15"/>
+              </w:rPr>
               <w:t>useState</w:t>
             </w:r>
             <w:proofErr w:type="spellEnd"/>
@@ -17609,10 +18536,9 @@
                 <w:sz w:val="15"/>
                 <w:szCs w:val="15"/>
               </w:rPr>
-              <w:t>("");</w:t>
-            </w:r>
-          </w:p>
-          <w:p>
+              <w:t>(</w:t>
+            </w:r>
+            <w:proofErr w:type="gramEnd"/>
             <w:r>
               <w:rPr>
                 <w:rFonts w:ascii="Consolas" w:eastAsia="Consolas" w:hAnsi="Consolas" w:cs="Consolas"/>
@@ -17620,9 +18546,21 @@
                 <w:sz w:val="15"/>
                 <w:szCs w:val="15"/>
               </w:rPr>
+              <w:t>"");</w:t>
+            </w:r>
+          </w:p>
+          <w:p>
+            <w:r>
+              <w:rPr>
+                <w:rFonts w:ascii="Consolas" w:eastAsia="Consolas" w:hAnsi="Consolas" w:cs="Consolas"/>
+                <w:color w:val="DCEFE5"/>
+                <w:sz w:val="15"/>
+                <w:szCs w:val="15"/>
+              </w:rPr>
               <w:t xml:space="preserve">  const [page, </w:t>
             </w:r>
             <w:proofErr w:type="spellStart"/>
+            <w:proofErr w:type="gramStart"/>
             <w:r>
               <w:rPr>
                 <w:rFonts w:ascii="Consolas" w:eastAsia="Consolas" w:hAnsi="Consolas" w:cs="Consolas"/>
@@ -17640,9 +18578,9 @@
                 <w:sz w:val="15"/>
                 <w:szCs w:val="15"/>
               </w:rPr>
-              <w:t xml:space="preserve">]     = </w:t>
-            </w:r>
-            <w:proofErr w:type="spellStart"/>
+              <w:t xml:space="preserve">]   </w:t>
+            </w:r>
+            <w:proofErr w:type="gramEnd"/>
             <w:r>
               <w:rPr>
                 <w:rFonts w:ascii="Consolas" w:eastAsia="Consolas" w:hAnsi="Consolas" w:cs="Consolas"/>
@@ -17650,6 +18588,17 @@
                 <w:sz w:val="15"/>
                 <w:szCs w:val="15"/>
               </w:rPr>
+              <w:t xml:space="preserve">  = </w:t>
+            </w:r>
+            <w:proofErr w:type="spellStart"/>
+            <w:proofErr w:type="gramStart"/>
+            <w:r>
+              <w:rPr>
+                <w:rFonts w:ascii="Consolas" w:eastAsia="Consolas" w:hAnsi="Consolas" w:cs="Consolas"/>
+                <w:color w:val="DCEFE5"/>
+                <w:sz w:val="15"/>
+                <w:szCs w:val="15"/>
+              </w:rPr>
               <w:t>useState</w:t>
             </w:r>
             <w:proofErr w:type="spellEnd"/>
@@ -17660,10 +18609,9 @@
                 <w:sz w:val="15"/>
                 <w:szCs w:val="15"/>
               </w:rPr>
-              <w:t>(1);</w:t>
-            </w:r>
-          </w:p>
-          <w:p>
+              <w:t>(</w:t>
+            </w:r>
+            <w:proofErr w:type="gramEnd"/>
             <w:r>
               <w:rPr>
                 <w:rFonts w:ascii="Consolas" w:eastAsia="Consolas" w:hAnsi="Consolas" w:cs="Consolas"/>
@@ -17671,7 +18619,7 @@
                 <w:sz w:val="15"/>
                 <w:szCs w:val="15"/>
               </w:rPr>
-              <w:t xml:space="preserve"> </w:t>
+              <w:t>1);</w:t>
             </w:r>
           </w:p>
           <w:p>
@@ -17682,9 +18630,21 @@
                 <w:sz w:val="15"/>
                 <w:szCs w:val="15"/>
               </w:rPr>
+              <w:t xml:space="preserve"> </w:t>
+            </w:r>
+          </w:p>
+          <w:p>
+            <w:r>
+              <w:rPr>
+                <w:rFonts w:ascii="Consolas" w:eastAsia="Consolas" w:hAnsi="Consolas" w:cs="Consolas"/>
+                <w:color w:val="DCEFE5"/>
+                <w:sz w:val="15"/>
+                <w:szCs w:val="15"/>
+              </w:rPr>
               <w:t xml:space="preserve">  </w:t>
             </w:r>
             <w:proofErr w:type="spellStart"/>
+            <w:proofErr w:type="gramStart"/>
             <w:r>
               <w:rPr>
                 <w:rFonts w:ascii="Consolas" w:eastAsia="Consolas" w:hAnsi="Consolas" w:cs="Consolas"/>
@@ -17702,10 +18662,9 @@
                 <w:sz w:val="15"/>
                 <w:szCs w:val="15"/>
               </w:rPr>
-              <w:t>(() =&gt; {</w:t>
-            </w:r>
-          </w:p>
-          <w:p>
+              <w:t>(</w:t>
+            </w:r>
+            <w:proofErr w:type="gramEnd"/>
             <w:r>
               <w:rPr>
                 <w:rFonts w:ascii="Consolas" w:eastAsia="Consolas" w:hAnsi="Consolas" w:cs="Consolas"/>
@@ -17713,6 +18672,17 @@
                 <w:sz w:val="15"/>
                 <w:szCs w:val="15"/>
               </w:rPr>
+              <w:t>() =&gt; {</w:t>
+            </w:r>
+          </w:p>
+          <w:p>
+            <w:r>
+              <w:rPr>
+                <w:rFonts w:ascii="Consolas" w:eastAsia="Consolas" w:hAnsi="Consolas" w:cs="Consolas"/>
+                <w:color w:val="DCEFE5"/>
+                <w:sz w:val="15"/>
+                <w:szCs w:val="15"/>
+              </w:rPr>
               <w:t xml:space="preserve">    fetch(`/</w:t>
             </w:r>
             <w:proofErr w:type="spellStart"/>
@@ -17784,9 +18754,9 @@
                 <w:sz w:val="15"/>
                 <w:szCs w:val="15"/>
               </w:rPr>
-              <w:t xml:space="preserve">      .then(r =&gt; </w:t>
-            </w:r>
-            <w:proofErr w:type="spellStart"/>
+              <w:t xml:space="preserve">      </w:t>
+            </w:r>
+            <w:proofErr w:type="gramStart"/>
             <w:r>
               <w:rPr>
                 <w:rFonts w:ascii="Consolas" w:eastAsia="Consolas" w:hAnsi="Consolas" w:cs="Consolas"/>
@@ -17794,9 +18764,31 @@
                 <w:sz w:val="15"/>
                 <w:szCs w:val="15"/>
               </w:rPr>
+              <w:t>.then</w:t>
+            </w:r>
+            <w:proofErr w:type="gramEnd"/>
+            <w:r>
+              <w:rPr>
+                <w:rFonts w:ascii="Consolas" w:eastAsia="Consolas" w:hAnsi="Consolas" w:cs="Consolas"/>
+                <w:color w:val="DCEFE5"/>
+                <w:sz w:val="15"/>
+                <w:szCs w:val="15"/>
+              </w:rPr>
+              <w:t xml:space="preserve">(r =&gt; </w:t>
+            </w:r>
+            <w:proofErr w:type="spellStart"/>
+            <w:proofErr w:type="gramStart"/>
+            <w:r>
+              <w:rPr>
+                <w:rFonts w:ascii="Consolas" w:eastAsia="Consolas" w:hAnsi="Consolas" w:cs="Consolas"/>
+                <w:color w:val="DCEFE5"/>
+                <w:sz w:val="15"/>
+                <w:szCs w:val="15"/>
+              </w:rPr>
               <w:t>r.json</w:t>
             </w:r>
             <w:proofErr w:type="spellEnd"/>
+            <w:proofErr w:type="gramEnd"/>
             <w:r>
               <w:rPr>
                 <w:rFonts w:ascii="Consolas" w:eastAsia="Consolas" w:hAnsi="Consolas" w:cs="Consolas"/>
@@ -17815,9 +18807,9 @@
                 <w:sz w:val="15"/>
                 <w:szCs w:val="15"/>
               </w:rPr>
-              <w:t xml:space="preserve">      .then(d =&gt; </w:t>
-            </w:r>
-            <w:proofErr w:type="spellStart"/>
+              <w:t xml:space="preserve">      </w:t>
+            </w:r>
+            <w:proofErr w:type="gramStart"/>
             <w:r>
               <w:rPr>
                 <w:rFonts w:ascii="Consolas" w:eastAsia="Consolas" w:hAnsi="Consolas" w:cs="Consolas"/>
@@ -17825,6 +18817,26 @@
                 <w:sz w:val="15"/>
                 <w:szCs w:val="15"/>
               </w:rPr>
+              <w:t>.then</w:t>
+            </w:r>
+            <w:proofErr w:type="gramEnd"/>
+            <w:r>
+              <w:rPr>
+                <w:rFonts w:ascii="Consolas" w:eastAsia="Consolas" w:hAnsi="Consolas" w:cs="Consolas"/>
+                <w:color w:val="DCEFE5"/>
+                <w:sz w:val="15"/>
+                <w:szCs w:val="15"/>
+              </w:rPr>
+              <w:t xml:space="preserve">(d =&gt; </w:t>
+            </w:r>
+            <w:proofErr w:type="spellStart"/>
+            <w:r>
+              <w:rPr>
+                <w:rFonts w:ascii="Consolas" w:eastAsia="Consolas" w:hAnsi="Consolas" w:cs="Consolas"/>
+                <w:color w:val="DCEFE5"/>
+                <w:sz w:val="15"/>
+                <w:szCs w:val="15"/>
+              </w:rPr>
               <w:t>setOrders</w:t>
             </w:r>
             <w:proofErr w:type="spellEnd"/>
@@ -17891,6 +18903,7 @@
               <w:t xml:space="preserve">  const total = </w:t>
             </w:r>
             <w:proofErr w:type="spellStart"/>
+            <w:proofErr w:type="gramStart"/>
             <w:r>
               <w:rPr>
                 <w:rFonts w:ascii="Consolas" w:eastAsia="Consolas" w:hAnsi="Consolas" w:cs="Consolas"/>
@@ -17901,6 +18914,7 @@
               <w:t>orders.reduce</w:t>
             </w:r>
             <w:proofErr w:type="spellEnd"/>
+            <w:proofErr w:type="gramEnd"/>
             <w:r>
               <w:rPr>
                 <w:rFonts w:ascii="Consolas" w:eastAsia="Consolas" w:hAnsi="Consolas" w:cs="Consolas"/>
@@ -17911,6 +18925,7 @@
               <w:t xml:space="preserve">((a, o) =&gt; a + </w:t>
             </w:r>
             <w:proofErr w:type="spellStart"/>
+            <w:proofErr w:type="gramStart"/>
             <w:r>
               <w:rPr>
                 <w:rFonts w:ascii="Consolas" w:eastAsia="Consolas" w:hAnsi="Consolas" w:cs="Consolas"/>
@@ -17921,6 +18936,7 @@
               <w:t>o.amount</w:t>
             </w:r>
             <w:proofErr w:type="spellEnd"/>
+            <w:proofErr w:type="gramEnd"/>
             <w:r>
               <w:rPr>
                 <w:rFonts w:ascii="Consolas" w:eastAsia="Consolas" w:hAnsi="Consolas" w:cs="Consolas"/>
@@ -17985,6 +19001,7 @@
               <w:t>onChange</w:t>
             </w:r>
             <w:proofErr w:type="spellEnd"/>
+            <w:proofErr w:type="gramStart"/>
             <w:r>
               <w:rPr>
                 <w:rFonts w:ascii="Consolas" w:eastAsia="Consolas" w:hAnsi="Consolas" w:cs="Consolas"/>
@@ -17992,9 +19009,9 @@
                 <w:sz w:val="15"/>
                 <w:szCs w:val="15"/>
               </w:rPr>
-              <w:t xml:space="preserve">={e =&gt; </w:t>
-            </w:r>
-            <w:proofErr w:type="spellStart"/>
+              <w:t>={</w:t>
+            </w:r>
+            <w:proofErr w:type="gramEnd"/>
             <w:r>
               <w:rPr>
                 <w:rFonts w:ascii="Consolas" w:eastAsia="Consolas" w:hAnsi="Consolas" w:cs="Consolas"/>
@@ -18002,6 +19019,16 @@
                 <w:sz w:val="15"/>
                 <w:szCs w:val="15"/>
               </w:rPr>
+              <w:t xml:space="preserve">e =&gt; </w:t>
+            </w:r>
+            <w:proofErr w:type="spellStart"/>
+            <w:r>
+              <w:rPr>
+                <w:rFonts w:ascii="Consolas" w:eastAsia="Consolas" w:hAnsi="Consolas" w:cs="Consolas"/>
+                <w:color w:val="DCEFE5"/>
+                <w:sz w:val="15"/>
+                <w:szCs w:val="15"/>
+              </w:rPr>
               <w:t>setQuery</w:t>
             </w:r>
             <w:proofErr w:type="spellEnd"/>
@@ -18015,6 +19042,7 @@
               <w:t>(</w:t>
             </w:r>
             <w:proofErr w:type="spellStart"/>
+            <w:proofErr w:type="gramStart"/>
             <w:r>
               <w:rPr>
                 <w:rFonts w:ascii="Consolas" w:eastAsia="Consolas" w:hAnsi="Consolas" w:cs="Consolas"/>
@@ -18022,9 +19050,9 @@
                 <w:sz w:val="15"/>
                 <w:szCs w:val="15"/>
               </w:rPr>
-              <w:t>e.target.value</w:t>
-            </w:r>
-            <w:proofErr w:type="spellEnd"/>
+              <w:t>e.target</w:t>
+            </w:r>
+            <w:proofErr w:type="gramEnd"/>
             <w:r>
               <w:rPr>
                 <w:rFonts w:ascii="Consolas" w:eastAsia="Consolas" w:hAnsi="Consolas" w:cs="Consolas"/>
@@ -18032,6 +19060,16 @@
                 <w:sz w:val="15"/>
                 <w:szCs w:val="15"/>
               </w:rPr>
+              <w:t>.value</w:t>
+            </w:r>
+            <w:proofErr w:type="spellEnd"/>
+            <w:r>
+              <w:rPr>
+                <w:rFonts w:ascii="Consolas" w:eastAsia="Consolas" w:hAnsi="Consolas" w:cs="Consolas"/>
+                <w:color w:val="DCEFE5"/>
+                <w:sz w:val="15"/>
+                <w:szCs w:val="15"/>
+              </w:rPr>
               <w:t>)} /&gt;</w:t>
             </w:r>
           </w:p>
@@ -18057,6 +19095,7 @@
               <w:t xml:space="preserve">      {</w:t>
             </w:r>
             <w:proofErr w:type="spellStart"/>
+            <w:proofErr w:type="gramStart"/>
             <w:r>
               <w:rPr>
                 <w:rFonts w:ascii="Consolas" w:eastAsia="Consolas" w:hAnsi="Consolas" w:cs="Consolas"/>
@@ -18074,10 +19113,9 @@
                 <w:sz w:val="15"/>
                 <w:szCs w:val="15"/>
               </w:rPr>
-              <w:t>(o =&gt; (</w:t>
-            </w:r>
-          </w:p>
-          <w:p>
+              <w:t>(</w:t>
+            </w:r>
+            <w:proofErr w:type="gramEnd"/>
             <w:r>
               <w:rPr>
                 <w:rFonts w:ascii="Consolas" w:eastAsia="Consolas" w:hAnsi="Consolas" w:cs="Consolas"/>
@@ -18085,9 +19123,10 @@
                 <w:sz w:val="15"/>
                 <w:szCs w:val="15"/>
               </w:rPr>
-              <w:t xml:space="preserve">        &lt;div key={</w:t>
-            </w:r>
-            <w:proofErr w:type="spellStart"/>
+              <w:t>o =&gt; (</w:t>
+            </w:r>
+          </w:p>
+          <w:p>
             <w:r>
               <w:rPr>
                 <w:rFonts w:ascii="Consolas" w:eastAsia="Consolas" w:hAnsi="Consolas" w:cs="Consolas"/>
@@ -18095,6 +19134,27 @@
                 <w:sz w:val="15"/>
                 <w:szCs w:val="15"/>
               </w:rPr>
+              <w:t xml:space="preserve">        &lt;div key</w:t>
+            </w:r>
+            <w:proofErr w:type="gramStart"/>
+            <w:r>
+              <w:rPr>
+                <w:rFonts w:ascii="Consolas" w:eastAsia="Consolas" w:hAnsi="Consolas" w:cs="Consolas"/>
+                <w:color w:val="DCEFE5"/>
+                <w:sz w:val="15"/>
+                <w:szCs w:val="15"/>
+              </w:rPr>
+              <w:t>={</w:t>
+            </w:r>
+            <w:proofErr w:type="spellStart"/>
+            <w:proofErr w:type="gramEnd"/>
+            <w:r>
+              <w:rPr>
+                <w:rFonts w:ascii="Consolas" w:eastAsia="Consolas" w:hAnsi="Consolas" w:cs="Consolas"/>
+                <w:color w:val="DCEFE5"/>
+                <w:sz w:val="15"/>
+                <w:szCs w:val="15"/>
+              </w:rPr>
               <w:t>Math.random</w:t>
             </w:r>
             <w:proofErr w:type="spellEnd"/>
@@ -18129,6 +19189,7 @@
               <w:t>dangerouslySetInnerHTML</w:t>
             </w:r>
             <w:proofErr w:type="spellEnd"/>
+            <w:proofErr w:type="gramStart"/>
             <w:r>
               <w:rPr>
                 <w:rFonts w:ascii="Consolas" w:eastAsia="Consolas" w:hAnsi="Consolas" w:cs="Consolas"/>
@@ -18136,9 +19197,9 @@
                 <w:sz w:val="15"/>
                 <w:szCs w:val="15"/>
               </w:rPr>
-              <w:t xml:space="preserve">={{ __html: </w:t>
-            </w:r>
-            <w:proofErr w:type="spellStart"/>
+              <w:t>={{ _</w:t>
+            </w:r>
+            <w:proofErr w:type="gramEnd"/>
             <w:r>
               <w:rPr>
                 <w:rFonts w:ascii="Consolas" w:eastAsia="Consolas" w:hAnsi="Consolas" w:cs="Consolas"/>
@@ -18146,9 +19207,21 @@
                 <w:sz w:val="15"/>
                 <w:szCs w:val="15"/>
               </w:rPr>
+              <w:t xml:space="preserve">_html: </w:t>
+            </w:r>
+            <w:proofErr w:type="spellStart"/>
+            <w:proofErr w:type="gramStart"/>
+            <w:r>
+              <w:rPr>
+                <w:rFonts w:ascii="Consolas" w:eastAsia="Consolas" w:hAnsi="Consolas" w:cs="Consolas"/>
+                <w:color w:val="DCEFE5"/>
+                <w:sz w:val="15"/>
+                <w:szCs w:val="15"/>
+              </w:rPr>
               <w:t>o.customerNote</w:t>
             </w:r>
             <w:proofErr w:type="spellEnd"/>
+            <w:proofErr w:type="gramEnd"/>
             <w:r>
               <w:rPr>
                 <w:rFonts w:ascii="Consolas" w:eastAsia="Consolas" w:hAnsi="Consolas" w:cs="Consolas"/>
@@ -18170,6 +19243,7 @@
               <w:t xml:space="preserve">          &lt;span&gt;Rp {</w:t>
             </w:r>
             <w:proofErr w:type="spellStart"/>
+            <w:proofErr w:type="gramStart"/>
             <w:r>
               <w:rPr>
                 <w:rFonts w:ascii="Consolas" w:eastAsia="Consolas" w:hAnsi="Consolas" w:cs="Consolas"/>
@@ -18180,6 +19254,7 @@
               <w:t>o.amount</w:t>
             </w:r>
             <w:proofErr w:type="spellEnd"/>
+            <w:proofErr w:type="gramEnd"/>
             <w:r>
               <w:rPr>
                 <w:rFonts w:ascii="Consolas" w:eastAsia="Consolas" w:hAnsi="Consolas" w:cs="Consolas"/>
@@ -18244,6 +19319,7 @@
               <w:t>onClick</w:t>
             </w:r>
             <w:proofErr w:type="spellEnd"/>
+            <w:proofErr w:type="gramStart"/>
             <w:r>
               <w:rPr>
                 <w:rFonts w:ascii="Consolas" w:eastAsia="Consolas" w:hAnsi="Consolas" w:cs="Consolas"/>
@@ -18251,9 +19327,9 @@
                 <w:sz w:val="15"/>
                 <w:szCs w:val="15"/>
               </w:rPr>
-              <w:t xml:space="preserve">={() =&gt; </w:t>
-            </w:r>
-            <w:proofErr w:type="spellStart"/>
+              <w:t>={</w:t>
+            </w:r>
+            <w:proofErr w:type="gramEnd"/>
             <w:r>
               <w:rPr>
                 <w:rFonts w:ascii="Consolas" w:eastAsia="Consolas" w:hAnsi="Consolas" w:cs="Consolas"/>
@@ -18261,6 +19337,17 @@
                 <w:sz w:val="15"/>
                 <w:szCs w:val="15"/>
               </w:rPr>
+              <w:t xml:space="preserve">() =&gt; </w:t>
+            </w:r>
+            <w:proofErr w:type="spellStart"/>
+            <w:proofErr w:type="gramStart"/>
+            <w:r>
+              <w:rPr>
+                <w:rFonts w:ascii="Consolas" w:eastAsia="Consolas" w:hAnsi="Consolas" w:cs="Consolas"/>
+                <w:color w:val="DCEFE5"/>
+                <w:sz w:val="15"/>
+                <w:szCs w:val="15"/>
+              </w:rPr>
               <w:t>setPage</w:t>
             </w:r>
             <w:proofErr w:type="spellEnd"/>
@@ -18271,7 +19358,17 @@
                 <w:sz w:val="15"/>
                 <w:szCs w:val="15"/>
               </w:rPr>
-              <w:t>(page + 1)}&gt;Next&lt;/button&gt;</w:t>
+              <w:t>(</w:t>
+            </w:r>
+            <w:proofErr w:type="gramEnd"/>
+            <w:r>
+              <w:rPr>
+                <w:rFonts w:ascii="Consolas" w:eastAsia="Consolas" w:hAnsi="Consolas" w:cs="Consolas"/>
+                <w:color w:val="DCEFE5"/>
+                <w:sz w:val="15"/>
+                <w:szCs w:val="15"/>
+              </w:rPr>
+              <w:t>page + 1)}&gt;Next&lt;/button&gt;</w:t>
             </w:r>
           </w:p>
           <w:p>
@@ -18649,7 +19746,29 @@
           <w:sz w:val="23"/>
           <w:szCs w:val="23"/>
         </w:rPr>
-        <w:t xml:space="preserve">C2. Backend   (10 </w:t>
+        <w:t>C2. Backend</w:t>
+      </w:r>
+      <w:proofErr w:type="gramStart"/>
+      <w:r>
+        <w:rPr>
+          <w:b/>
+          <w:bCs/>
+          <w:color w:val="14543E"/>
+          <w:sz w:val="23"/>
+          <w:szCs w:val="23"/>
+        </w:rPr>
+        <w:t xml:space="preserve">   (</w:t>
+      </w:r>
+      <w:proofErr w:type="gramEnd"/>
+      <w:r>
+        <w:rPr>
+          <w:b/>
+          <w:bCs/>
+          <w:color w:val="14543E"/>
+          <w:sz w:val="23"/>
+          <w:szCs w:val="23"/>
+        </w:rPr>
+        <w:t xml:space="preserve">10 </w:t>
       </w:r>
       <w:proofErr w:type="spellStart"/>
       <w:r>
@@ -18762,9 +19881,9 @@
                 <w:sz w:val="15"/>
                 <w:szCs w:val="15"/>
               </w:rPr>
-              <w:t xml:space="preserve">import { </w:t>
-            </w:r>
-            <w:proofErr w:type="spellStart"/>
+              <w:t xml:space="preserve">import </w:t>
+            </w:r>
+            <w:proofErr w:type="gramStart"/>
             <w:r>
               <w:rPr>
                 <w:rFonts w:ascii="Consolas" w:eastAsia="Consolas" w:hAnsi="Consolas" w:cs="Consolas"/>
@@ -18772,9 +19891,20 @@
                 <w:sz w:val="15"/>
                 <w:szCs w:val="15"/>
               </w:rPr>
+              <w:t xml:space="preserve">{ </w:t>
+            </w:r>
+            <w:proofErr w:type="spellStart"/>
+            <w:r>
+              <w:rPr>
+                <w:rFonts w:ascii="Consolas" w:eastAsia="Consolas" w:hAnsi="Consolas" w:cs="Consolas"/>
+                <w:color w:val="DCEFE5"/>
+                <w:sz w:val="15"/>
+                <w:szCs w:val="15"/>
+              </w:rPr>
               <w:t>db</w:t>
             </w:r>
             <w:proofErr w:type="spellEnd"/>
+            <w:proofErr w:type="gramEnd"/>
             <w:r>
               <w:rPr>
                 <w:rFonts w:ascii="Consolas" w:eastAsia="Consolas" w:hAnsi="Consolas" w:cs="Consolas"/>
@@ -18824,10 +19954,9 @@
                 <w:sz w:val="15"/>
                 <w:szCs w:val="15"/>
               </w:rPr>
-              <w:t>export async function GET(req: Request) {</w:t>
-            </w:r>
-          </w:p>
-          <w:p>
+              <w:t xml:space="preserve">export async function </w:t>
+            </w:r>
+            <w:proofErr w:type="gramStart"/>
             <w:r>
               <w:rPr>
                 <w:rFonts w:ascii="Consolas" w:eastAsia="Consolas" w:hAnsi="Consolas" w:cs="Consolas"/>
@@ -18835,9 +19964,9 @@
                 <w:sz w:val="15"/>
                 <w:szCs w:val="15"/>
               </w:rPr>
-              <w:t xml:space="preserve">  const { </w:t>
-            </w:r>
-            <w:proofErr w:type="spellStart"/>
+              <w:t>GET(</w:t>
+            </w:r>
+            <w:proofErr w:type="gramEnd"/>
             <w:r>
               <w:rPr>
                 <w:rFonts w:ascii="Consolas" w:eastAsia="Consolas" w:hAnsi="Consolas" w:cs="Consolas"/>
@@ -18845,9 +19974,41 @@
                 <w:sz w:val="15"/>
                 <w:szCs w:val="15"/>
               </w:rPr>
+              <w:t>req: Request) {</w:t>
+            </w:r>
+          </w:p>
+          <w:p>
+            <w:r>
+              <w:rPr>
+                <w:rFonts w:ascii="Consolas" w:eastAsia="Consolas" w:hAnsi="Consolas" w:cs="Consolas"/>
+                <w:color w:val="DCEFE5"/>
+                <w:sz w:val="15"/>
+                <w:szCs w:val="15"/>
+              </w:rPr>
+              <w:t xml:space="preserve">  const </w:t>
+            </w:r>
+            <w:proofErr w:type="gramStart"/>
+            <w:r>
+              <w:rPr>
+                <w:rFonts w:ascii="Consolas" w:eastAsia="Consolas" w:hAnsi="Consolas" w:cs="Consolas"/>
+                <w:color w:val="DCEFE5"/>
+                <w:sz w:val="15"/>
+                <w:szCs w:val="15"/>
+              </w:rPr>
+              <w:t xml:space="preserve">{ </w:t>
+            </w:r>
+            <w:proofErr w:type="spellStart"/>
+            <w:r>
+              <w:rPr>
+                <w:rFonts w:ascii="Consolas" w:eastAsia="Consolas" w:hAnsi="Consolas" w:cs="Consolas"/>
+                <w:color w:val="DCEFE5"/>
+                <w:sz w:val="15"/>
+                <w:szCs w:val="15"/>
+              </w:rPr>
               <w:t>searchParams</w:t>
             </w:r>
             <w:proofErr w:type="spellEnd"/>
+            <w:proofErr w:type="gramEnd"/>
             <w:r>
               <w:rPr>
                 <w:rFonts w:ascii="Consolas" w:eastAsia="Consolas" w:hAnsi="Consolas" w:cs="Consolas"/>
@@ -18855,10 +20016,9 @@
                 <w:sz w:val="15"/>
                 <w:szCs w:val="15"/>
               </w:rPr>
-              <w:t xml:space="preserve"> } = new URL(req.url);</w:t>
-            </w:r>
-          </w:p>
-          <w:p>
+              <w:t xml:space="preserve"> } = new </w:t>
+            </w:r>
+            <w:proofErr w:type="gramStart"/>
             <w:r>
               <w:rPr>
                 <w:rFonts w:ascii="Consolas" w:eastAsia="Consolas" w:hAnsi="Consolas" w:cs="Consolas"/>
@@ -18866,6 +20026,27 @@
                 <w:sz w:val="15"/>
                 <w:szCs w:val="15"/>
               </w:rPr>
+              <w:t>URL(</w:t>
+            </w:r>
+            <w:proofErr w:type="gramEnd"/>
+            <w:r>
+              <w:rPr>
+                <w:rFonts w:ascii="Consolas" w:eastAsia="Consolas" w:hAnsi="Consolas" w:cs="Consolas"/>
+                <w:color w:val="DCEFE5"/>
+                <w:sz w:val="15"/>
+                <w:szCs w:val="15"/>
+              </w:rPr>
+              <w:t>req.url);</w:t>
+            </w:r>
+          </w:p>
+          <w:p>
+            <w:r>
+              <w:rPr>
+                <w:rFonts w:ascii="Consolas" w:eastAsia="Consolas" w:hAnsi="Consolas" w:cs="Consolas"/>
+                <w:color w:val="DCEFE5"/>
+                <w:sz w:val="15"/>
+                <w:szCs w:val="15"/>
+              </w:rPr>
               <w:t xml:space="preserve">  const q      = </w:t>
             </w:r>
             <w:proofErr w:type="spellStart"/>
@@ -18886,10 +20067,9 @@
                 <w:sz w:val="15"/>
                 <w:szCs w:val="15"/>
               </w:rPr>
-              <w:t>("q") ?? "";</w:t>
-            </w:r>
-          </w:p>
-          <w:p>
+              <w:t>("q"</w:t>
+            </w:r>
+            <w:proofErr w:type="gramStart"/>
             <w:r>
               <w:rPr>
                 <w:rFonts w:ascii="Consolas" w:eastAsia="Consolas" w:hAnsi="Consolas" w:cs="Consolas"/>
@@ -18897,6 +20077,27 @@
                 <w:sz w:val="15"/>
                 <w:szCs w:val="15"/>
               </w:rPr>
+              <w:t>) ??</w:t>
+            </w:r>
+            <w:proofErr w:type="gramEnd"/>
+            <w:r>
+              <w:rPr>
+                <w:rFonts w:ascii="Consolas" w:eastAsia="Consolas" w:hAnsi="Consolas" w:cs="Consolas"/>
+                <w:color w:val="DCEFE5"/>
+                <w:sz w:val="15"/>
+                <w:szCs w:val="15"/>
+              </w:rPr>
+              <w:t xml:space="preserve"> "";</w:t>
+            </w:r>
+          </w:p>
+          <w:p>
+            <w:r>
+              <w:rPr>
+                <w:rFonts w:ascii="Consolas" w:eastAsia="Consolas" w:hAnsi="Consolas" w:cs="Consolas"/>
+                <w:color w:val="DCEFE5"/>
+                <w:sz w:val="15"/>
+                <w:szCs w:val="15"/>
+              </w:rPr>
               <w:t xml:space="preserve">  const branch = </w:t>
             </w:r>
             <w:proofErr w:type="spellStart"/>
@@ -18973,6 +20174,7 @@
               <w:t xml:space="preserve">  const rows = await </w:t>
             </w:r>
             <w:proofErr w:type="spellStart"/>
+            <w:proofErr w:type="gramStart"/>
             <w:r>
               <w:rPr>
                 <w:rFonts w:ascii="Consolas" w:eastAsia="Consolas" w:hAnsi="Consolas" w:cs="Consolas"/>
@@ -18983,6 +20185,7 @@
               <w:t>db.query</w:t>
             </w:r>
             <w:proofErr w:type="spellEnd"/>
+            <w:proofErr w:type="gramEnd"/>
             <w:r>
               <w:rPr>
                 <w:rFonts w:ascii="Consolas" w:eastAsia="Consolas" w:hAnsi="Consolas" w:cs="Consolas"/>
@@ -19140,6 +20343,7 @@
               <w:t>Response.json</w:t>
             </w:r>
             <w:proofErr w:type="spellEnd"/>
+            <w:proofErr w:type="gramStart"/>
             <w:r>
               <w:rPr>
                 <w:rFonts w:ascii="Consolas" w:eastAsia="Consolas" w:hAnsi="Consolas" w:cs="Consolas"/>
@@ -19147,7 +20351,37 @@
                 <w:sz w:val="15"/>
                 <w:szCs w:val="15"/>
               </w:rPr>
-              <w:t>({ data: rows });</w:t>
+              <w:t>({ data</w:t>
+            </w:r>
+            <w:proofErr w:type="gramEnd"/>
+            <w:r>
+              <w:rPr>
+                <w:rFonts w:ascii="Consolas" w:eastAsia="Consolas" w:hAnsi="Consolas" w:cs="Consolas"/>
+                <w:color w:val="DCEFE5"/>
+                <w:sz w:val="15"/>
+                <w:szCs w:val="15"/>
+              </w:rPr>
+              <w:t xml:space="preserve">: </w:t>
+            </w:r>
+            <w:proofErr w:type="gramStart"/>
+            <w:r>
+              <w:rPr>
+                <w:rFonts w:ascii="Consolas" w:eastAsia="Consolas" w:hAnsi="Consolas" w:cs="Consolas"/>
+                <w:color w:val="DCEFE5"/>
+                <w:sz w:val="15"/>
+                <w:szCs w:val="15"/>
+              </w:rPr>
+              <w:t>rows }</w:t>
+            </w:r>
+            <w:proofErr w:type="gramEnd"/>
+            <w:r>
+              <w:rPr>
+                <w:rFonts w:ascii="Consolas" w:eastAsia="Consolas" w:hAnsi="Consolas" w:cs="Consolas"/>
+                <w:color w:val="DCEFE5"/>
+                <w:sz w:val="15"/>
+                <w:szCs w:val="15"/>
+              </w:rPr>
+              <w:t>);</w:t>
             </w:r>
           </w:p>
           <w:p>
@@ -19493,7 +20727,29 @@
           <w:szCs w:val="30"/>
         </w:rPr>
         <w:lastRenderedPageBreak/>
-        <w:t xml:space="preserve">Bagian D — Mini Feature (Take-home)  (25 </w:t>
+        <w:t>Bagian D — Mini Feature (Take-</w:t>
+      </w:r>
+      <w:proofErr w:type="gramStart"/>
+      <w:r>
+        <w:rPr>
+          <w:b/>
+          <w:bCs/>
+          <w:color w:val="0B3D2E"/>
+          <w:sz w:val="30"/>
+          <w:szCs w:val="30"/>
+        </w:rPr>
+        <w:t>home)  (</w:t>
+      </w:r>
+      <w:proofErr w:type="gramEnd"/>
+      <w:r>
+        <w:rPr>
+          <w:b/>
+          <w:bCs/>
+          <w:color w:val="0B3D2E"/>
+          <w:sz w:val="30"/>
+          <w:szCs w:val="30"/>
+        </w:rPr>
+        <w:t xml:space="preserve">25 </w:t>
       </w:r>
       <w:proofErr w:type="spellStart"/>
       <w:r>
@@ -20132,7 +21388,15 @@
       </w:r>
       <w:proofErr w:type="spellEnd"/>
       <w:r>
-        <w:t xml:space="preserve"> swap 24 jam.</w:t>
+        <w:t xml:space="preserve"> swap 24 </w:t>
+      </w:r>
+      <w:proofErr w:type="gramStart"/>
+      <w:r>
+        <w:t>jam</w:t>
+      </w:r>
+      <w:proofErr w:type="gramEnd"/>
+      <w:r>
+        <w:t>.</w:t>
       </w:r>
     </w:p>
     <w:p>
@@ -22478,7 +23742,29 @@
           <w:szCs w:val="30"/>
         </w:rPr>
         <w:lastRenderedPageBreak/>
-        <w:t xml:space="preserve">Bagian E — Live Defense  (30 </w:t>
+        <w:t xml:space="preserve">Bagian E — Live </w:t>
+      </w:r>
+      <w:proofErr w:type="gramStart"/>
+      <w:r>
+        <w:rPr>
+          <w:b/>
+          <w:bCs/>
+          <w:color w:val="0B3D2E"/>
+          <w:sz w:val="30"/>
+          <w:szCs w:val="30"/>
+        </w:rPr>
+        <w:t>Defense  (</w:t>
+      </w:r>
+      <w:proofErr w:type="gramEnd"/>
+      <w:r>
+        <w:rPr>
+          <w:b/>
+          <w:bCs/>
+          <w:color w:val="0B3D2E"/>
+          <w:sz w:val="30"/>
+          <w:szCs w:val="30"/>
+        </w:rPr>
+        <w:t xml:space="preserve">30 </w:t>
       </w:r>
       <w:proofErr w:type="spellStart"/>
       <w:r>
@@ -24950,7 +26236,43 @@
         <w:sz w:val="15"/>
         <w:szCs w:val="15"/>
       </w:rPr>
-      <w:t xml:space="preserve"> Developer  ·  Confidential  ·  Hal. </w:t>
+      <w:t xml:space="preserve"> </w:t>
+    </w:r>
+    <w:proofErr w:type="gramStart"/>
+    <w:r>
+      <w:rPr>
+        <w:color w:val="6B7280"/>
+        <w:sz w:val="15"/>
+        <w:szCs w:val="15"/>
+      </w:rPr>
+      <w:t>Developer  ·</w:t>
+    </w:r>
+    <w:proofErr w:type="gramEnd"/>
+    <w:r>
+      <w:rPr>
+        <w:color w:val="6B7280"/>
+        <w:sz w:val="15"/>
+        <w:szCs w:val="15"/>
+      </w:rPr>
+      <w:t xml:space="preserve">  </w:t>
+    </w:r>
+    <w:proofErr w:type="gramStart"/>
+    <w:r>
+      <w:rPr>
+        <w:color w:val="6B7280"/>
+        <w:sz w:val="15"/>
+        <w:szCs w:val="15"/>
+      </w:rPr>
+      <w:t>Confidential  ·</w:t>
+    </w:r>
+    <w:proofErr w:type="gramEnd"/>
+    <w:r>
+      <w:rPr>
+        <w:color w:val="6B7280"/>
+        <w:sz w:val="15"/>
+        <w:szCs w:val="15"/>
+      </w:rPr>
+      <w:t xml:space="preserve">  Hal. </w:t>
     </w:r>
     <w:r>
       <w:rPr>

</xml_diff>